<commit_message>
Added RL project page, fixed opening
</commit_message>
<xml_diff>
--- a/Thomas Russell - Resume 2026.docx
+++ b/Thomas Russell - Resume 2026.docx
@@ -22,196 +22,16 @@
         <mc:AlternateContent>
           <mc:Choice Requires="wps">
             <w:drawing>
-              <wp:anchor distT="45720" distB="45720" distL="114300" distR="114300" simplePos="0" relativeHeight="251661312" behindDoc="1" locked="0" layoutInCell="1" allowOverlap="1" wp14:anchorId="587DD3F2" wp14:editId="4BA18846">
-                <wp:simplePos x="0" y="0"/>
-                <wp:positionH relativeFrom="margin">
-                  <wp:align>left</wp:align>
-                </wp:positionH>
-                <wp:positionV relativeFrom="paragraph">
-                  <wp:posOffset>71</wp:posOffset>
-                </wp:positionV>
-                <wp:extent cx="2811780" cy="810883"/>
-                <wp:effectExtent l="0" t="0" r="7620" b="8890"/>
-                <wp:wrapNone/>
-                <wp:docPr id="1951872005" name="Text Box 2"/>
-                <wp:cNvGraphicFramePr>
-                  <a:graphicFrameLocks xmlns:a="http://schemas.openxmlformats.org/drawingml/2006/main"/>
-                </wp:cNvGraphicFramePr>
-                <a:graphic xmlns:a="http://schemas.openxmlformats.org/drawingml/2006/main">
-                  <a:graphicData uri="http://schemas.microsoft.com/office/word/2010/wordprocessingShape">
-                    <wps:wsp>
-                      <wps:cNvSpPr txBox="1">
-                        <a:spLocks noChangeArrowheads="1"/>
-                      </wps:cNvSpPr>
-                      <wps:spPr bwMode="auto">
-                        <a:xfrm>
-                          <a:off x="0" y="0"/>
-                          <a:ext cx="2811780" cy="810883"/>
-                        </a:xfrm>
-                        <a:prstGeom prst="rect">
-                          <a:avLst/>
-                        </a:prstGeom>
-                        <a:solidFill>
-                          <a:srgbClr val="FFFFFF"/>
-                        </a:solidFill>
-                        <a:ln w="9525">
-                          <a:noFill/>
-                          <a:miter lim="800000"/>
-                          <a:headEnd/>
-                          <a:tailEnd/>
-                        </a:ln>
-                      </wps:spPr>
-                      <wps:txbx>
-                        <w:txbxContent>
-                          <w:p>
-                            <w:pPr>
-                              <w:pStyle w:val="Title"/>
-                              <w:rPr>
-                                <w:caps w:val="0"/>
-                                <w:sz w:val="52"/>
-                                <w:szCs w:val="36"/>
-                                <w:lang w:val="en-GB"/>
-                              </w:rPr>
-                            </w:pPr>
-                            <w:r>
-                              <w:rPr>
-                                <w:caps w:val="0"/>
-                                <w:sz w:val="52"/>
-                                <w:szCs w:val="36"/>
-                                <w:lang w:val="en-GB"/>
-                              </w:rPr>
-                              <w:t>Thomas Russell</w:t>
-                            </w:r>
-                          </w:p>
-                          <w:p>
-                            <w:pPr>
-                              <w:pStyle w:val="Subtitle"/>
-                              <w:rPr>
-                                <w:rFonts w:asciiTheme="majorHAnsi" w:hAnsiTheme="majorHAnsi"/>
-                                <w:sz w:val="22"/>
-                                <w:szCs w:val="22"/>
-                                <w:lang w:val="en-GB"/>
-                              </w:rPr>
-                            </w:pPr>
-                            <w:r>
-                              <w:rPr>
-                                <w:rFonts w:asciiTheme="majorHAnsi" w:hAnsiTheme="majorHAnsi"/>
-                                <w:sz w:val="22"/>
-                                <w:szCs w:val="22"/>
-                                <w:lang w:val="en-GB"/>
-                              </w:rPr>
-                              <w:t>Aerospace engineering and science student</w:t>
-                            </w:r>
-                          </w:p>
-                          <w:p>
-                            <w:pPr>
-                              <w:rPr>
-                                <w:lang w:val="en-GB"/>
-                              </w:rPr>
-                            </w:pPr>
-                          </w:p>
-                        </w:txbxContent>
-                      </wps:txbx>
-                      <wps:bodyPr rot="0" vert="horz" wrap="square" lIns="91440" tIns="45720" rIns="91440" bIns="45720" anchor="t" anchorCtr="0">
-                        <a:noAutofit/>
-                      </wps:bodyPr>
-                    </wps:wsp>
-                  </a:graphicData>
-                </a:graphic>
-                <wp14:sizeRelH relativeFrom="margin">
-                  <wp14:pctWidth>0</wp14:pctWidth>
-                </wp14:sizeRelH>
-                <wp14:sizeRelV relativeFrom="margin">
-                  <wp14:pctHeight>0</wp14:pctHeight>
-                </wp14:sizeRelV>
-              </wp:anchor>
-            </w:drawing>
-          </mc:Choice>
-          <mc:Fallback>
-            <w:pict>
-              <v:shapetype w14:anchorId="587DD3F2" id="_x0000_t202" coordsize="21600,21600" o:spt="202" path="m,l,21600r21600,l21600,xe">
-                <v:stroke joinstyle="miter"/>
-                <v:path gradientshapeok="t" o:connecttype="rect"/>
-              </v:shapetype>
-              <v:shape id="Text Box 2" o:spid="_x0000_s1026" type="#_x0000_t202" style="position:absolute;margin-left:0;margin-top:0;width:221.4pt;height:63.85pt;z-index:-251655168;visibility:visible;mso-wrap-style:square;mso-width-percent:0;mso-height-percent:0;mso-wrap-distance-left:9pt;mso-wrap-distance-top:3.6pt;mso-wrap-distance-right:9pt;mso-wrap-distance-bottom:3.6pt;mso-position-horizontal:left;mso-position-horizontal-relative:margin;mso-position-vertical:absolute;mso-position-vertical-relative:text;mso-width-percent:0;mso-height-percent:0;mso-width-relative:margin;mso-height-relative:margin;v-text-anchor:top" o:gfxdata="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" stroked="f">
-                <v:textbox>
-                  <w:txbxContent>
-                    <w:p>
-                      <w:pPr>
-                        <w:pStyle w:val="Title"/>
-                        <w:rPr>
-                          <w:caps w:val="0"/>
-                          <w:sz w:val="52"/>
-                          <w:szCs w:val="36"/>
-                          <w:lang w:val="en-GB"/>
-                        </w:rPr>
-                      </w:pPr>
-                      <w:r>
-                        <w:rPr>
-                          <w:caps w:val="0"/>
-                          <w:sz w:val="52"/>
-                          <w:szCs w:val="36"/>
-                          <w:lang w:val="en-GB"/>
-                        </w:rPr>
-                        <w:t>Thomas Russell</w:t>
-                      </w:r>
-                    </w:p>
-                    <w:p>
-                      <w:pPr>
-                        <w:pStyle w:val="Subtitle"/>
-                        <w:rPr>
-                          <w:rFonts w:asciiTheme="majorHAnsi" w:hAnsiTheme="majorHAnsi"/>
-                          <w:sz w:val="22"/>
-                          <w:szCs w:val="22"/>
-                          <w:lang w:val="en-GB"/>
-                        </w:rPr>
-                      </w:pPr>
-                      <w:r>
-                        <w:rPr>
-                          <w:rFonts w:asciiTheme="majorHAnsi" w:hAnsiTheme="majorHAnsi"/>
-                          <w:sz w:val="22"/>
-                          <w:szCs w:val="22"/>
-                          <w:lang w:val="en-GB"/>
-                        </w:rPr>
-                        <w:t>Aerospace engineering and science student</w:t>
-                      </w:r>
-                    </w:p>
-                    <w:p>
-                      <w:pPr>
-                        <w:rPr>
-                          <w:lang w:val="en-GB"/>
-                        </w:rPr>
-                      </w:pPr>
-                    </w:p>
-                  </w:txbxContent>
-                </v:textbox>
-                <w10:wrap anchorx="margin"/>
-              </v:shape>
-            </w:pict>
-          </mc:Fallback>
-        </mc:AlternateContent>
-      </w:r>
-      <w:r>
-        <w:rPr>
-          <w:caps w:val="0"/>
-          <w:noProof/>
-          <w:sz w:val="52"/>
-          <w:szCs w:val="36"/>
-          <w:lang w:val="en-GB"/>
-        </w:rPr>
-        <mc:AlternateContent>
-          <mc:Choice Requires="wps">
-            <w:drawing>
-              <wp:anchor distT="45720" distB="45720" distL="114300" distR="114300" simplePos="0" relativeHeight="251659264" behindDoc="0" locked="0" layoutInCell="1" allowOverlap="1" wp14:anchorId="7A2C728B" wp14:editId="177E4DDE">
+              <wp:anchor distT="45720" distB="45720" distL="114300" distR="114300" simplePos="0" relativeHeight="251659264" behindDoc="0" locked="0" layoutInCell="1" allowOverlap="1" wp14:anchorId="7A2C728B" wp14:editId="02D15839">
                 <wp:simplePos x="0" y="0"/>
                 <wp:positionH relativeFrom="margin">
                   <wp:align>right</wp:align>
                 </wp:positionH>
                 <wp:positionV relativeFrom="paragraph">
-                  <wp:posOffset>12065</wp:posOffset>
+                  <wp:posOffset>9525</wp:posOffset>
                 </wp:positionV>
-                <wp:extent cx="2244090" cy="499745"/>
-                <wp:effectExtent l="0" t="0" r="3810" b="0"/>
+                <wp:extent cx="2253615" cy="499745"/>
+                <wp:effectExtent l="0" t="0" r="0" b="0"/>
                 <wp:wrapSquare wrapText="bothSides"/>
                 <wp:docPr id="217" name="Text Box 2"/>
                 <wp:cNvGraphicFramePr>
@@ -226,14 +46,12 @@
                       <wps:spPr bwMode="auto">
                         <a:xfrm>
                           <a:off x="0" y="0"/>
-                          <a:ext cx="2244090" cy="499745"/>
+                          <a:ext cx="2253615" cy="499745"/>
                         </a:xfrm>
                         <a:prstGeom prst="rect">
                           <a:avLst/>
                         </a:prstGeom>
-                        <a:solidFill>
-                          <a:srgbClr val="FFFFFF"/>
-                        </a:solidFill>
+                        <a:noFill/>
                         <a:ln w="9525">
                           <a:noFill/>
                           <a:miter lim="800000"/>
@@ -350,7 +168,11 @@
           </mc:Choice>
           <mc:Fallback>
             <w:pict>
-              <v:shape w14:anchorId="7A2C728B" id="_x0000_s1027" type="#_x0000_t202" style="position:absolute;margin-left:125.5pt;margin-top:.95pt;width:176.7pt;height:39.35pt;z-index:251659264;visibility:visible;mso-wrap-style:square;mso-width-percent:0;mso-height-percent:0;mso-wrap-distance-left:9pt;mso-wrap-distance-top:3.6pt;mso-wrap-distance-right:9pt;mso-wrap-distance-bottom:3.6pt;mso-position-horizontal:right;mso-position-horizontal-relative:margin;mso-position-vertical:absolute;mso-position-vertical-relative:text;mso-width-percent:0;mso-height-percent:0;mso-width-relative:margin;mso-height-relative:margin;v-text-anchor:top" o:gfxdata="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" stroked="f">
+              <v:shapetype w14:anchorId="7A2C728B" id="_x0000_t202" coordsize="21600,21600" o:spt="202" path="m,l,21600r21600,l21600,xe">
+                <v:stroke joinstyle="miter"/>
+                <v:path gradientshapeok="t" o:connecttype="rect"/>
+              </v:shapetype>
+              <v:shape id="Text Box 2" o:spid="_x0000_s1026" type="#_x0000_t202" style="position:absolute;margin-left:126.25pt;margin-top:.75pt;width:177.45pt;height:39.35pt;z-index:251659264;visibility:visible;mso-wrap-style:square;mso-width-percent:0;mso-height-percent:0;mso-wrap-distance-left:9pt;mso-wrap-distance-top:3.6pt;mso-wrap-distance-right:9pt;mso-wrap-distance-bottom:3.6pt;mso-position-horizontal:right;mso-position-horizontal-relative:margin;mso-position-vertical:absolute;mso-position-vertical-relative:text;mso-width-percent:0;mso-height-percent:0;mso-width-relative:margin;mso-height-relative:margin;v-text-anchor:top" o:gfxdata="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" filled="f" stroked="f">
                 <v:textbox>
                   <w:txbxContent>
                     <w:p>
@@ -449,6 +271,236 @@
           </mc:Fallback>
         </mc:AlternateContent>
       </w:r>
+      <w:r>
+        <w:rPr>
+          <w:caps w:val="0"/>
+          <w:noProof/>
+          <w:sz w:val="52"/>
+          <w:szCs w:val="36"/>
+          <w:lang w:val="en-GB"/>
+        </w:rPr>
+        <mc:AlternateContent>
+          <mc:Choice Requires="wps">
+            <w:drawing>
+              <wp:anchor distT="45720" distB="45720" distL="114300" distR="114300" simplePos="0" relativeHeight="251661312" behindDoc="1" locked="0" layoutInCell="1" allowOverlap="1" wp14:anchorId="587DD3F2" wp14:editId="7DB894B6">
+                <wp:simplePos x="0" y="0"/>
+                <wp:positionH relativeFrom="margin">
+                  <wp:align>left</wp:align>
+                </wp:positionH>
+                <wp:positionV relativeFrom="paragraph">
+                  <wp:posOffset>71</wp:posOffset>
+                </wp:positionV>
+                <wp:extent cx="4848225" cy="647700"/>
+                <wp:effectExtent l="0" t="0" r="9525" b="0"/>
+                <wp:wrapNone/>
+                <wp:docPr id="1951872005" name="Text Box 2"/>
+                <wp:cNvGraphicFramePr>
+                  <a:graphicFrameLocks xmlns:a="http://schemas.openxmlformats.org/drawingml/2006/main"/>
+                </wp:cNvGraphicFramePr>
+                <a:graphic xmlns:a="http://schemas.openxmlformats.org/drawingml/2006/main">
+                  <a:graphicData uri="http://schemas.microsoft.com/office/word/2010/wordprocessingShape">
+                    <wps:wsp>
+                      <wps:cNvSpPr txBox="1">
+                        <a:spLocks noChangeArrowheads="1"/>
+                      </wps:cNvSpPr>
+                      <wps:spPr bwMode="auto">
+                        <a:xfrm>
+                          <a:off x="0" y="0"/>
+                          <a:ext cx="4848225" cy="647700"/>
+                        </a:xfrm>
+                        <a:prstGeom prst="rect">
+                          <a:avLst/>
+                        </a:prstGeom>
+                        <a:solidFill>
+                          <a:srgbClr val="FFFFFF"/>
+                        </a:solidFill>
+                        <a:ln w="9525">
+                          <a:noFill/>
+                          <a:miter lim="800000"/>
+                          <a:headEnd/>
+                          <a:tailEnd/>
+                        </a:ln>
+                      </wps:spPr>
+                      <wps:txbx>
+                        <w:txbxContent>
+                          <w:p>
+                            <w:pPr>
+                              <w:pStyle w:val="Title"/>
+                              <w:rPr>
+                                <w:caps w:val="0"/>
+                                <w:sz w:val="52"/>
+                                <w:szCs w:val="36"/>
+                                <w:lang w:val="en-GB"/>
+                              </w:rPr>
+                            </w:pPr>
+                            <w:r>
+                              <w:rPr>
+                                <w:caps w:val="0"/>
+                                <w:sz w:val="52"/>
+                                <w:szCs w:val="36"/>
+                                <w:lang w:val="en-GB"/>
+                              </w:rPr>
+                              <w:t>Thomas Russell</w:t>
+                            </w:r>
+                          </w:p>
+                          <w:p>
+                            <w:pPr>
+                              <w:pStyle w:val="Subtitle"/>
+                              <w:rPr>
+                                <w:rFonts w:asciiTheme="majorHAnsi" w:hAnsiTheme="majorHAnsi"/>
+                                <w:sz w:val="22"/>
+                                <w:szCs w:val="22"/>
+                                <w:lang w:val="en-GB"/>
+                              </w:rPr>
+                            </w:pPr>
+                            <w:r>
+                              <w:rPr>
+                                <w:rFonts w:asciiTheme="majorHAnsi" w:hAnsiTheme="majorHAnsi"/>
+                                <w:sz w:val="22"/>
+                                <w:szCs w:val="22"/>
+                                <w:lang w:val="en-GB"/>
+                              </w:rPr>
+                              <w:t>Aerospace engineering</w:t>
+                            </w:r>
+                            <w:r>
+                              <w:rPr>
+                                <w:rFonts w:asciiTheme="majorHAnsi" w:hAnsiTheme="majorHAnsi"/>
+                                <w:sz w:val="22"/>
+                                <w:szCs w:val="22"/>
+                                <w:lang w:val="en-GB"/>
+                              </w:rPr>
+                              <w:t xml:space="preserve"> </w:t>
+                            </w:r>
+                            <w:r>
+                              <w:rPr>
+                                <w:rFonts w:asciiTheme="majorHAnsi" w:hAnsiTheme="majorHAnsi"/>
+                                <w:sz w:val="22"/>
+                                <w:szCs w:val="22"/>
+                                <w:lang w:val="en-GB"/>
+                              </w:rPr>
+                              <w:t xml:space="preserve">and science </w:t>
+                            </w:r>
+                            <w:r>
+                              <w:rPr>
+                                <w:rFonts w:asciiTheme="majorHAnsi" w:hAnsiTheme="majorHAnsi"/>
+                                <w:sz w:val="22"/>
+                                <w:szCs w:val="22"/>
+                                <w:lang w:val="en-GB"/>
+                              </w:rPr>
+                              <w:t>GRADUATE</w:t>
+                            </w:r>
+                          </w:p>
+                          <w:p>
+                            <w:pPr>
+                              <w:rPr>
+                                <w:lang w:val="en-GB"/>
+                              </w:rPr>
+                            </w:pPr>
+                          </w:p>
+                        </w:txbxContent>
+                      </wps:txbx>
+                      <wps:bodyPr rot="0" vert="horz" wrap="square" lIns="91440" tIns="45720" rIns="91440" bIns="45720" anchor="t" anchorCtr="0">
+                        <a:noAutofit/>
+                      </wps:bodyPr>
+                    </wps:wsp>
+                  </a:graphicData>
+                </a:graphic>
+                <wp14:sizeRelH relativeFrom="margin">
+                  <wp14:pctWidth>0</wp14:pctWidth>
+                </wp14:sizeRelH>
+                <wp14:sizeRelV relativeFrom="margin">
+                  <wp14:pctHeight>0</wp14:pctHeight>
+                </wp14:sizeRelV>
+              </wp:anchor>
+            </w:drawing>
+          </mc:Choice>
+          <mc:Fallback>
+            <w:pict>
+              <v:shape w14:anchorId="587DD3F2" id="_x0000_s1027" type="#_x0000_t202" style="position:absolute;margin-left:0;margin-top:0;width:381.75pt;height:51pt;z-index:-251655168;visibility:visible;mso-wrap-style:square;mso-width-percent:0;mso-height-percent:0;mso-wrap-distance-left:9pt;mso-wrap-distance-top:3.6pt;mso-wrap-distance-right:9pt;mso-wrap-distance-bottom:3.6pt;mso-position-horizontal:left;mso-position-horizontal-relative:margin;mso-position-vertical:absolute;mso-position-vertical-relative:text;mso-width-percent:0;mso-height-percent:0;mso-width-relative:margin;mso-height-relative:margin;v-text-anchor:top" o:gfxdata="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" stroked="f">
+                <v:textbox>
+                  <w:txbxContent>
+                    <w:p>
+                      <w:pPr>
+                        <w:pStyle w:val="Title"/>
+                        <w:rPr>
+                          <w:caps w:val="0"/>
+                          <w:sz w:val="52"/>
+                          <w:szCs w:val="36"/>
+                          <w:lang w:val="en-GB"/>
+                        </w:rPr>
+                      </w:pPr>
+                      <w:r>
+                        <w:rPr>
+                          <w:caps w:val="0"/>
+                          <w:sz w:val="52"/>
+                          <w:szCs w:val="36"/>
+                          <w:lang w:val="en-GB"/>
+                        </w:rPr>
+                        <w:t>Thomas Russell</w:t>
+                      </w:r>
+                    </w:p>
+                    <w:p>
+                      <w:pPr>
+                        <w:pStyle w:val="Subtitle"/>
+                        <w:rPr>
+                          <w:rFonts w:asciiTheme="majorHAnsi" w:hAnsiTheme="majorHAnsi"/>
+                          <w:sz w:val="22"/>
+                          <w:szCs w:val="22"/>
+                          <w:lang w:val="en-GB"/>
+                        </w:rPr>
+                      </w:pPr>
+                      <w:r>
+                        <w:rPr>
+                          <w:rFonts w:asciiTheme="majorHAnsi" w:hAnsiTheme="majorHAnsi"/>
+                          <w:sz w:val="22"/>
+                          <w:szCs w:val="22"/>
+                          <w:lang w:val="en-GB"/>
+                        </w:rPr>
+                        <w:t>Aerospace engineering</w:t>
+                      </w:r>
+                      <w:r>
+                        <w:rPr>
+                          <w:rFonts w:asciiTheme="majorHAnsi" w:hAnsiTheme="majorHAnsi"/>
+                          <w:sz w:val="22"/>
+                          <w:szCs w:val="22"/>
+                          <w:lang w:val="en-GB"/>
+                        </w:rPr>
+                        <w:t xml:space="preserve"> </w:t>
+                      </w:r>
+                      <w:r>
+                        <w:rPr>
+                          <w:rFonts w:asciiTheme="majorHAnsi" w:hAnsiTheme="majorHAnsi"/>
+                          <w:sz w:val="22"/>
+                          <w:szCs w:val="22"/>
+                          <w:lang w:val="en-GB"/>
+                        </w:rPr>
+                        <w:t xml:space="preserve">and science </w:t>
+                      </w:r>
+                      <w:r>
+                        <w:rPr>
+                          <w:rFonts w:asciiTheme="majorHAnsi" w:hAnsiTheme="majorHAnsi"/>
+                          <w:sz w:val="22"/>
+                          <w:szCs w:val="22"/>
+                          <w:lang w:val="en-GB"/>
+                        </w:rPr>
+                        <w:t>GRADUATE</w:t>
+                      </w:r>
+                    </w:p>
+                    <w:p>
+                      <w:pPr>
+                        <w:rPr>
+                          <w:lang w:val="en-GB"/>
+                        </w:rPr>
+                      </w:pPr>
+                    </w:p>
+                  </w:txbxContent>
+                </v:textbox>
+                <w10:wrap anchorx="margin"/>
+              </v:shape>
+            </w:pict>
+          </mc:Fallback>
+        </mc:AlternateContent>
+      </w:r>
     </w:p>
     <w:p>
       <w:pPr>
@@ -464,9 +516,34 @@
     <w:p>
       <w:pPr>
         <w:pStyle w:val="Heading1"/>
+        <w:tabs>
+          <w:tab w:val="left" w:pos="6135"/>
+        </w:tabs>
         <w:rPr>
           <w:sz w:val="20"/>
           <w:szCs w:val="20"/>
+          <w:lang w:val="en-GB"/>
+        </w:rPr>
+      </w:pPr>
+      <w:r>
+        <w:rPr>
+          <w:sz w:val="20"/>
+          <w:szCs w:val="20"/>
+          <w:lang w:val="en-GB"/>
+        </w:rPr>
+        <w:tab/>
+      </w:r>
+    </w:p>
+    <w:p>
+      <w:pPr>
+        <w:rPr>
+          <w:rStyle w:val="Heading1Char"/>
+          <w:rFonts w:eastAsiaTheme="minorEastAsia" w:cstheme="minorBidi"/>
+          <w:caps w:val="0"/>
+          <w:color w:val="262626" w:themeColor="text1" w:themeTint="D9"/>
+          <w:spacing w:val="0"/>
+          <w:sz w:val="12"/>
+          <w:szCs w:val="12"/>
           <w:lang w:val="en-GB"/>
         </w:rPr>
       </w:pPr>
@@ -480,34 +557,32 @@
           <w:lang w:val="en-GB"/>
         </w:rPr>
       </w:pPr>
-    </w:p>
-    <w:p>
-      <w:pPr>
-        <w:pStyle w:val="Heading1"/>
-        <w:rPr>
-          <w:sz w:val="20"/>
-          <w:szCs w:val="20"/>
-          <w:lang w:val="en-GB"/>
-        </w:rPr>
-      </w:pPr>
-    </w:p>
-    <w:p>
-      <w:pPr>
-        <w:pStyle w:val="Heading1"/>
-        <w:rPr>
-          <w:sz w:val="20"/>
-          <w:szCs w:val="20"/>
-          <w:lang w:val="en-GB"/>
-        </w:rPr>
-      </w:pPr>
-      <w:r>
-        <w:rPr>
-          <w:sz w:val="20"/>
-          <w:szCs w:val="20"/>
-          <w:lang w:val="en-GB"/>
-        </w:rPr>
-        <w:t>profile</w:t>
-      </w:r>
+      <w:sdt>
+        <w:sdtPr>
+          <w:rPr>
+            <w:sz w:val="20"/>
+            <w:szCs w:val="20"/>
+            <w:lang w:val="en-GB"/>
+          </w:rPr>
+          <w:id w:val="1904716257"/>
+          <w:placeholder>
+            <w:docPart w:val="9A1A3614FFCE4769AA697192D0793E01"/>
+          </w:placeholder>
+          <w:temporary/>
+          <w:showingPlcHdr/>
+          <w15:appearance w15:val="hidden"/>
+        </w:sdtPr>
+        <w:sdtContent>
+          <w:r>
+            <w:rPr>
+              <w:sz w:val="20"/>
+              <w:szCs w:val="20"/>
+              <w:lang w:val="en-GB"/>
+            </w:rPr>
+            <w:t>Skills &amp; Abilities</w:t>
+          </w:r>
+        </w:sdtContent>
+      </w:sdt>
     </w:p>
     <w:p>
       <w:pPr>
@@ -529,10 +604,10 @@
         <mc:AlternateContent>
           <mc:Choice Requires="wps">
             <w:drawing>
-              <wp:inline distT="0" distB="0" distL="0" distR="0" wp14:anchorId="0924DA7D" wp14:editId="226FC843">
+              <wp:inline distT="0" distB="0" distL="0" distR="0" wp14:anchorId="0B3350BE" wp14:editId="4AAD3E26">
                 <wp:extent cx="5943600" cy="0"/>
                 <wp:effectExtent l="0" t="0" r="0" b="0"/>
-                <wp:docPr id="290712055" name="Straight Connector 290712055">
+                <wp:docPr id="16880014" name="Straight Connector 16880014">
                   <a:extLst xmlns:a="http://schemas.openxmlformats.org/drawingml/2006/main">
                     <a:ext uri="{C183D7F6-B498-43B3-948B-1728B52AA6E4}">
                       <adec:decorative xmlns:adec="http://schemas.microsoft.com/office/drawing/2017/decorative" val="1"/>
@@ -552,28 +627,18 @@
                         <a:prstGeom prst="line">
                           <a:avLst/>
                         </a:prstGeom>
-                        <a:ln w="6350">
+                        <a:noFill/>
+                        <a:ln w="6350" cap="flat" cmpd="sng" algn="ctr">
                           <a:solidFill>
-                            <a:schemeClr val="bg1">
+                            <a:sysClr val="window" lastClr="FFFFFF">
                               <a:lumMod val="75000"/>
-                            </a:schemeClr>
+                            </a:sysClr>
                           </a:solidFill>
+                          <a:prstDash val="solid"/>
+                          <a:miter lim="800000"/>
                         </a:ln>
+                        <a:effectLst/>
                       </wps:spPr>
-                      <wps:style>
-                        <a:lnRef idx="1">
-                          <a:schemeClr val="accent1"/>
-                        </a:lnRef>
-                        <a:fillRef idx="0">
-                          <a:schemeClr val="accent1"/>
-                        </a:fillRef>
-                        <a:effectRef idx="0">
-                          <a:schemeClr val="accent1"/>
-                        </a:effectRef>
-                        <a:fontRef idx="minor">
-                          <a:schemeClr val="tx1"/>
-                        </a:fontRef>
-                      </wps:style>
                       <wps:bodyPr/>
                     </wps:wsp>
                   </a:graphicData>
@@ -583,7 +648,7 @@
           </mc:Choice>
           <mc:Fallback>
             <w:pict>
-              <v:line w14:anchorId="6E450DEB" id="Straight Connector 290712055" o:spid="_x0000_s1026" alt="&quot;&quot;" style="visibility:visible;mso-wrap-style:square;mso-left-percent:-10001;mso-top-percent:-10001;mso-position-horizontal:absolute;mso-position-horizontal-relative:char;mso-position-vertical:absolute;mso-position-vertical-relative:line;mso-left-percent:-10001;mso-top-percent:-10001" from="0,0" to="468pt,0" o:gfxdata="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" strokecolor="#bfbfbf [2412]" strokeweight=".5pt">
+              <v:line w14:anchorId="02771F20" id="Straight Connector 16880014" o:spid="_x0000_s1026" alt="&quot;&quot;" style="visibility:visible;mso-wrap-style:square;mso-left-percent:-10001;mso-top-percent:-10001;mso-position-horizontal:absolute;mso-position-horizontal-relative:char;mso-position-vertical:absolute;mso-position-vertical-relative:line;mso-left-percent:-10001;mso-top-percent:-10001" from="0,0" to="468pt,0" o:gfxdata="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" strokecolor="#bfbfbf" strokeweight=".5pt">
                 <v:stroke joinstyle="miter"/>
                 <w10:anchorlock/>
               </v:line>
@@ -594,143 +659,134 @@
     </w:p>
     <w:p>
       <w:pPr>
+        <w:spacing w:before="0"/>
         <w:rPr>
-          <w:rFonts w:asciiTheme="majorHAnsi" w:hAnsiTheme="majorHAnsi" w:cstheme="minorHAnsi"/>
-          <w:color w:val="1E2532"/>
+          <w:rFonts w:asciiTheme="majorHAnsi" w:hAnsiTheme="majorHAnsi"/>
+          <w:color w:val="auto"/>
           <w:sz w:val="20"/>
           <w:szCs w:val="20"/>
-          <w:lang w:val="en-GB"/>
+          <w:lang w:val="en-AU"/>
         </w:rPr>
       </w:pPr>
       <w:r>
         <w:rPr>
-          <w:rFonts w:asciiTheme="majorHAnsi" w:hAnsiTheme="majorHAnsi" w:cstheme="minorHAnsi"/>
-          <w:color w:val="1E2532"/>
+          <w:rFonts w:asciiTheme="majorHAnsi" w:hAnsiTheme="majorHAnsi"/>
+          <w:b/>
+          <w:bCs/>
+          <w:color w:val="0D3C4E" w:themeColor="text2" w:themeTint="E6"/>
           <w:sz w:val="20"/>
           <w:szCs w:val="20"/>
-          <w:lang w:val="en-GB"/>
+          <w:lang w:val="en-AU"/>
         </w:rPr>
-        <w:t xml:space="preserve">A passionate and experienced </w:t>
+        <w:t>Software &amp; CAD/CAM:</w:t>
       </w:r>
       <w:r>
         <w:rPr>
-          <w:rFonts w:asciiTheme="majorHAnsi" w:hAnsiTheme="majorHAnsi" w:cstheme="minorHAnsi"/>
-          <w:color w:val="1E2532"/>
+          <w:rFonts w:asciiTheme="majorHAnsi" w:hAnsiTheme="majorHAnsi"/>
+          <w:color w:val="0D3C4E" w:themeColor="text2" w:themeTint="E6"/>
           <w:sz w:val="20"/>
           <w:szCs w:val="20"/>
-          <w:lang w:val="en-GB"/>
+          <w:lang w:val="en-AU"/>
         </w:rPr>
-        <w:t>final</w:t>
+        <w:t xml:space="preserve"> </w:t>
       </w:r>
       <w:r>
         <w:rPr>
-          <w:rFonts w:asciiTheme="majorHAnsi" w:hAnsiTheme="majorHAnsi" w:cstheme="minorHAnsi"/>
-          <w:color w:val="1E2532"/>
+          <w:rFonts w:asciiTheme="majorHAnsi" w:hAnsiTheme="majorHAnsi"/>
+          <w:color w:val="auto"/>
           <w:sz w:val="20"/>
           <w:szCs w:val="20"/>
-          <w:lang w:val="en-GB"/>
+          <w:lang w:val="en-AU"/>
         </w:rPr>
-        <w:t xml:space="preserve"> year Aerospace Engineering and Science student at Monash University. </w:t>
+        <w:t xml:space="preserve">Siemens NX (+ Teamcenter), SolidWorks 2025, PTC Creo (+ Windchill PLM), Fusion 360 CAM, KiCad </w:t>
+      </w:r>
+    </w:p>
+    <w:p>
+      <w:pPr>
+        <w:spacing w:before="0"/>
+        <w:rPr>
+          <w:rFonts w:asciiTheme="majorHAnsi" w:hAnsiTheme="majorHAnsi"/>
+          <w:color w:val="auto"/>
+          <w:sz w:val="20"/>
+          <w:szCs w:val="20"/>
+          <w:lang w:val="en-AU"/>
+        </w:rPr>
+      </w:pPr>
+      <w:r>
+        <w:rPr>
+          <w:rFonts w:asciiTheme="majorHAnsi" w:hAnsiTheme="majorHAnsi"/>
+          <w:b/>
+          <w:bCs/>
+          <w:color w:val="0D3C4E" w:themeColor="text2" w:themeTint="E6"/>
+          <w:sz w:val="20"/>
+          <w:szCs w:val="20"/>
+          <w:lang w:val="en-AU"/>
+        </w:rPr>
+        <w:t>Simulation &amp; DAQ:</w:t>
       </w:r>
       <w:r>
         <w:rPr>
-          <w:rFonts w:asciiTheme="majorHAnsi" w:hAnsiTheme="majorHAnsi" w:cstheme="minorHAnsi"/>
-          <w:color w:val="1E2532"/>
+          <w:rFonts w:asciiTheme="majorHAnsi" w:hAnsiTheme="majorHAnsi"/>
+          <w:color w:val="0D3C4E" w:themeColor="text2" w:themeTint="E6"/>
           <w:sz w:val="20"/>
           <w:szCs w:val="20"/>
-          <w:lang w:val="en-GB"/>
+          <w:lang w:val="en-AU"/>
         </w:rPr>
-        <w:t xml:space="preserve">Working towards a career in propulsion, fluids engineering and manufacturing. Exemplifying these goals </w:t>
+        <w:t xml:space="preserve"> </w:t>
       </w:r>
       <w:r>
         <w:rPr>
-          <w:rFonts w:asciiTheme="majorHAnsi" w:hAnsiTheme="majorHAnsi" w:cstheme="minorHAnsi"/>
-          <w:color w:val="1E2532"/>
+          <w:rFonts w:asciiTheme="majorHAnsi" w:hAnsiTheme="majorHAnsi"/>
+          <w:color w:val="auto"/>
           <w:sz w:val="20"/>
           <w:szCs w:val="20"/>
-          <w:lang w:val="en-GB"/>
+          <w:lang w:val="en-AU"/>
         </w:rPr>
-        <w:t>leading a student engineering team of 1</w:t>
+        <w:t xml:space="preserve">ANSYS (FEA/CFD), NX Simcenter (NASTRAN), MATLAB &amp; Simulink, Python, C++, C#, JavaScript, LabVIEW, LabJack </w:t>
+      </w:r>
+    </w:p>
+    <w:p>
+      <w:pPr>
+        <w:spacing w:before="0"/>
+        <w:rPr>
+          <w:rFonts w:asciiTheme="majorHAnsi" w:hAnsiTheme="majorHAnsi"/>
+          <w:color w:val="auto"/>
+          <w:sz w:val="20"/>
+          <w:szCs w:val="20"/>
+          <w:lang w:val="en-AU"/>
+        </w:rPr>
+      </w:pPr>
+      <w:r>
+        <w:rPr>
+          <w:rFonts w:asciiTheme="majorHAnsi" w:hAnsiTheme="majorHAnsi"/>
+          <w:b/>
+          <w:bCs/>
+          <w:color w:val="0D3C4E" w:themeColor="text2" w:themeTint="E6"/>
+          <w:sz w:val="20"/>
+          <w:szCs w:val="20"/>
+          <w:lang w:val="en-AU"/>
+        </w:rPr>
+        <w:t>Manufacturing:</w:t>
       </w:r>
       <w:r>
         <w:rPr>
-          <w:rFonts w:asciiTheme="majorHAnsi" w:hAnsiTheme="majorHAnsi" w:cstheme="minorHAnsi"/>
-          <w:color w:val="1E2532"/>
+          <w:rFonts w:asciiTheme="majorHAnsi" w:hAnsiTheme="majorHAnsi"/>
+          <w:color w:val="0D3C4E" w:themeColor="text2" w:themeTint="E6"/>
           <w:sz w:val="20"/>
           <w:szCs w:val="20"/>
-          <w:lang w:val="en-GB"/>
+          <w:lang w:val="en-AU"/>
         </w:rPr>
-        <w:t>5</w:t>
+        <w:t xml:space="preserve"> </w:t>
       </w:r>
       <w:r>
         <w:rPr>
-          <w:rFonts w:asciiTheme="majorHAnsi" w:hAnsiTheme="majorHAnsi" w:cstheme="minorHAnsi"/>
-          <w:color w:val="1E2532"/>
+          <w:rFonts w:asciiTheme="majorHAnsi" w:hAnsiTheme="majorHAnsi"/>
+          <w:color w:val="auto"/>
           <w:sz w:val="20"/>
           <w:szCs w:val="20"/>
-          <w:lang w:val="en-GB"/>
+          <w:lang w:val="en-AU"/>
         </w:rPr>
-        <w:t>0 students</w:t>
-      </w:r>
-      <w:r>
-        <w:rPr>
-          <w:rFonts w:asciiTheme="majorHAnsi" w:hAnsiTheme="majorHAnsi" w:cstheme="minorHAnsi"/>
-          <w:color w:val="1E2532"/>
-          <w:sz w:val="20"/>
-          <w:szCs w:val="20"/>
-          <w:lang w:val="en-GB"/>
-        </w:rPr>
-        <w:t>, an internship at Rocket Lab, various rocketry projects</w:t>
-      </w:r>
-      <w:r>
-        <w:rPr>
-          <w:rFonts w:asciiTheme="majorHAnsi" w:hAnsiTheme="majorHAnsi" w:cstheme="minorHAnsi"/>
-          <w:color w:val="1E2532"/>
-          <w:sz w:val="20"/>
-          <w:szCs w:val="20"/>
-          <w:lang w:val="en-GB"/>
-        </w:rPr>
-        <w:t xml:space="preserve"> and </w:t>
-      </w:r>
-      <w:r>
-        <w:rPr>
-          <w:rFonts w:asciiTheme="majorHAnsi" w:hAnsiTheme="majorHAnsi" w:cstheme="minorHAnsi"/>
-          <w:color w:val="1E2532"/>
-          <w:sz w:val="20"/>
-          <w:szCs w:val="20"/>
-          <w:lang w:val="en-GB"/>
-        </w:rPr>
-        <w:t xml:space="preserve">working </w:t>
-      </w:r>
-      <w:r>
-        <w:rPr>
-          <w:rFonts w:asciiTheme="majorHAnsi" w:hAnsiTheme="majorHAnsi" w:cstheme="minorHAnsi"/>
-          <w:color w:val="1E2532"/>
-          <w:sz w:val="20"/>
-          <w:szCs w:val="20"/>
-          <w:lang w:val="en-GB"/>
-        </w:rPr>
-        <w:t xml:space="preserve">part-time </w:t>
-      </w:r>
-      <w:r>
-        <w:rPr>
-          <w:rFonts w:asciiTheme="majorHAnsi" w:hAnsiTheme="majorHAnsi" w:cstheme="minorHAnsi"/>
-          <w:color w:val="1E2532"/>
-          <w:sz w:val="20"/>
-          <w:szCs w:val="20"/>
-          <w:lang w:val="en-GB"/>
-        </w:rPr>
-        <w:t>in aerospace.</w:t>
-      </w:r>
-      <w:r>
-        <w:rPr>
-          <w:rFonts w:asciiTheme="majorHAnsi" w:hAnsiTheme="majorHAnsi" w:cstheme="minorHAnsi"/>
-          <w:color w:val="1E2532"/>
-          <w:sz w:val="20"/>
-          <w:szCs w:val="20"/>
-          <w:lang w:val="en-GB"/>
-        </w:rPr>
-        <w:t xml:space="preserve"> </w:t>
+        <w:t>Machining (CNC/Manual Milling &amp; Lathe), Additive Manufacturing, Fabrication, Welding, Composites, Drawing (ASME Y14.5)</w:t>
       </w:r>
     </w:p>
     <w:p>
@@ -743,13 +799,14 @@
           <w:spacing w:val="0"/>
           <w:sz w:val="12"/>
           <w:szCs w:val="12"/>
-          <w:lang w:val="en-GB"/>
+          <w:lang w:val="en-AU"/>
         </w:rPr>
       </w:pPr>
     </w:p>
     <w:p>
       <w:pPr>
         <w:pStyle w:val="Heading1"/>
+        <w:spacing w:before="0"/>
         <w:rPr>
           <w:rStyle w:val="Heading1Char"/>
           <w:caps/>
@@ -844,6 +901,7 @@
     </w:p>
     <w:p>
       <w:pPr>
+        <w:spacing w:before="0"/>
         <w:rPr>
           <w:rFonts w:asciiTheme="majorHAnsi" w:hAnsiTheme="majorHAnsi"/>
           <w:b/>
@@ -858,22 +916,42 @@
           <w:b/>
           <w:bCs/>
           <w:color w:val="004A67" w:themeColor="accent1" w:themeShade="80"/>
+          <w:sz w:val="20"/>
+          <w:szCs w:val="20"/>
           <w:lang w:val="en-GB"/>
         </w:rPr>
         <w:t>Rocket Lab Development Engineer, Neutron Thrust Module</w:t>
       </w:r>
-    </w:p>
-    <w:p>
-      <w:pPr>
+      <w:r>
         <w:rPr>
           <w:rFonts w:asciiTheme="majorHAnsi" w:hAnsiTheme="majorHAnsi"/>
-          <w:i/>
-          <w:iCs/>
-          <w:sz w:val="20"/>
-          <w:szCs w:val="20"/>
+          <w:b/>
+          <w:bCs/>
+          <w:color w:val="004A67" w:themeColor="accent1" w:themeShade="80"/>
           <w:lang w:val="en-GB"/>
         </w:rPr>
-      </w:pPr>
+        <w:t xml:space="preserve">             </w:t>
+      </w:r>
+      <w:r>
+        <w:rPr>
+          <w:rFonts w:asciiTheme="majorHAnsi" w:hAnsiTheme="majorHAnsi"/>
+          <w:b/>
+          <w:bCs/>
+          <w:color w:val="004A67" w:themeColor="accent1" w:themeShade="80"/>
+          <w:lang w:val="en-GB"/>
+        </w:rPr>
+        <w:t xml:space="preserve">           </w:t>
+      </w:r>
+      <w:r>
+        <w:rPr>
+          <w:rFonts w:asciiTheme="majorHAnsi" w:hAnsiTheme="majorHAnsi"/>
+          <w:b/>
+          <w:bCs/>
+          <w:color w:val="004A67" w:themeColor="accent1" w:themeShade="80"/>
+          <w:lang w:val="en-GB"/>
+        </w:rPr>
+        <w:t xml:space="preserve">  </w:t>
+      </w:r>
       <w:r>
         <w:rPr>
           <w:rFonts w:asciiTheme="majorHAnsi" w:hAnsiTheme="majorHAnsi"/>
@@ -948,7 +1026,7 @@
           <w:ilvl w:val="0"/>
           <w:numId w:val="18"/>
         </w:numPr>
-        <w:spacing w:line="276" w:lineRule="auto"/>
+        <w:spacing w:before="0" w:line="276" w:lineRule="auto"/>
         <w:rPr>
           <w:rFonts w:asciiTheme="majorHAnsi" w:hAnsiTheme="majorHAnsi"/>
           <w:sz w:val="20"/>
@@ -961,99 +1039,8 @@
           <w:rFonts w:asciiTheme="majorHAnsi" w:hAnsiTheme="majorHAnsi"/>
           <w:sz w:val="20"/>
           <w:szCs w:val="20"/>
-          <w:lang w:val="en-GB"/>
         </w:rPr>
-        <w:t>Performed analysis on various structural components</w:t>
-      </w:r>
-      <w:r>
-        <w:rPr>
-          <w:rFonts w:asciiTheme="majorHAnsi" w:hAnsiTheme="majorHAnsi"/>
-          <w:sz w:val="20"/>
-          <w:szCs w:val="20"/>
-          <w:lang w:val="en-GB"/>
-        </w:rPr>
-        <w:t>, reported on findings,</w:t>
-      </w:r>
-      <w:r>
-        <w:rPr>
-          <w:rFonts w:asciiTheme="majorHAnsi" w:hAnsiTheme="majorHAnsi"/>
-          <w:sz w:val="20"/>
-          <w:szCs w:val="20"/>
-          <w:lang w:val="en-GB"/>
-        </w:rPr>
-        <w:t xml:space="preserve"> </w:t>
-      </w:r>
-      <w:r>
-        <w:rPr>
-          <w:rFonts w:asciiTheme="majorHAnsi" w:hAnsiTheme="majorHAnsi"/>
-          <w:sz w:val="20"/>
-          <w:szCs w:val="20"/>
-          <w:lang w:val="en-GB"/>
-        </w:rPr>
-        <w:t xml:space="preserve">proposed </w:t>
-      </w:r>
-      <w:r>
-        <w:rPr>
-          <w:rFonts w:asciiTheme="majorHAnsi" w:hAnsiTheme="majorHAnsi"/>
-          <w:sz w:val="20"/>
-          <w:szCs w:val="20"/>
-          <w:lang w:val="en-GB"/>
-        </w:rPr>
-        <w:t>next steps discussions and subsequent</w:t>
-      </w:r>
-      <w:r>
-        <w:rPr>
-          <w:rFonts w:asciiTheme="majorHAnsi" w:hAnsiTheme="majorHAnsi"/>
-          <w:sz w:val="20"/>
-          <w:szCs w:val="20"/>
-          <w:lang w:val="en-GB"/>
-        </w:rPr>
-        <w:t xml:space="preserve">ly </w:t>
-      </w:r>
-      <w:r>
-        <w:rPr>
-          <w:rFonts w:asciiTheme="majorHAnsi" w:hAnsiTheme="majorHAnsi"/>
-          <w:sz w:val="20"/>
-          <w:szCs w:val="20"/>
-          <w:lang w:val="en-GB"/>
-        </w:rPr>
-        <w:t>iterat</w:t>
-      </w:r>
-      <w:r>
-        <w:rPr>
-          <w:rFonts w:asciiTheme="majorHAnsi" w:hAnsiTheme="majorHAnsi"/>
-          <w:sz w:val="20"/>
-          <w:szCs w:val="20"/>
-          <w:lang w:val="en-GB"/>
-        </w:rPr>
-        <w:t>ed</w:t>
-      </w:r>
-      <w:r>
-        <w:rPr>
-          <w:rFonts w:asciiTheme="majorHAnsi" w:hAnsiTheme="majorHAnsi"/>
-          <w:sz w:val="20"/>
-          <w:szCs w:val="20"/>
-          <w:lang w:val="en-GB"/>
-        </w:rPr>
-        <w:t xml:space="preserve"> on</w:t>
-      </w:r>
-      <w:r>
-        <w:rPr>
-          <w:rFonts w:asciiTheme="majorHAnsi" w:hAnsiTheme="majorHAnsi"/>
-          <w:sz w:val="20"/>
-          <w:szCs w:val="20"/>
-          <w:lang w:val="en-GB"/>
-        </w:rPr>
-        <w:t xml:space="preserve"> designs as</w:t>
-      </w:r>
-      <w:r>
-        <w:rPr>
-          <w:rFonts w:asciiTheme="majorHAnsi" w:hAnsiTheme="majorHAnsi"/>
-          <w:sz w:val="20"/>
-          <w:szCs w:val="20"/>
-          <w:lang w:val="en-GB"/>
-        </w:rPr>
-        <w:t xml:space="preserve"> necessary.</w:t>
+        <w:t>Executed structural analysis and sub-system testing on the thrust module to drive validation and flight qualification.</w:t>
       </w:r>
     </w:p>
     <w:p>
@@ -1063,7 +1050,7 @@
           <w:ilvl w:val="0"/>
           <w:numId w:val="18"/>
         </w:numPr>
-        <w:spacing w:line="276" w:lineRule="auto"/>
+        <w:spacing w:before="0" w:line="276" w:lineRule="auto"/>
         <w:rPr>
           <w:rFonts w:asciiTheme="majorHAnsi" w:hAnsiTheme="majorHAnsi"/>
           <w:sz w:val="20"/>
@@ -1076,52 +1063,8 @@
           <w:rFonts w:asciiTheme="majorHAnsi" w:hAnsiTheme="majorHAnsi"/>
           <w:sz w:val="20"/>
           <w:szCs w:val="20"/>
-          <w:lang w:val="en-GB"/>
         </w:rPr>
-        <w:t xml:space="preserve">Designed and executed </w:t>
-      </w:r>
-      <w:r>
-        <w:rPr>
-          <w:rFonts w:asciiTheme="majorHAnsi" w:hAnsiTheme="majorHAnsi"/>
-          <w:sz w:val="20"/>
-          <w:szCs w:val="20"/>
-          <w:lang w:val="en-GB"/>
-        </w:rPr>
-        <w:t>tests for large sub-systems of Neutron in pursuit of validation and qualification.</w:t>
-      </w:r>
-    </w:p>
-    <w:p>
-      <w:pPr>
-        <w:pStyle w:val="ListParagraph"/>
-        <w:numPr>
-          <w:ilvl w:val="0"/>
-          <w:numId w:val="18"/>
-        </w:numPr>
-        <w:spacing w:line="276" w:lineRule="auto"/>
-        <w:rPr>
-          <w:rFonts w:asciiTheme="majorHAnsi" w:hAnsiTheme="majorHAnsi"/>
-          <w:sz w:val="20"/>
-          <w:szCs w:val="20"/>
-          <w:lang w:val="en-GB"/>
-        </w:rPr>
-      </w:pPr>
-      <w:r>
-        <w:rPr>
-          <w:rFonts w:asciiTheme="majorHAnsi" w:hAnsiTheme="majorHAnsi"/>
-          <w:sz w:val="20"/>
-          <w:szCs w:val="20"/>
-          <w:lang w:val="en-GB"/>
-        </w:rPr>
-        <w:t>Carried components from de</w:t>
-      </w:r>
-      <w:r>
-        <w:rPr>
-          <w:rFonts w:asciiTheme="majorHAnsi" w:hAnsiTheme="majorHAnsi"/>
-          <w:sz w:val="20"/>
-          <w:szCs w:val="20"/>
-          <w:lang w:val="en-GB"/>
-        </w:rPr>
-        <w:t>sign to release and manufacture including concepts, CAD and drawing packages.</w:t>
+        <w:t>Owned the complete component lifecycle, from conceptual design and CAD modeling to final drawing packages and manufacturing release.</w:t>
       </w:r>
     </w:p>
     <w:p>
@@ -1140,9 +1083,11 @@
           <w:b/>
           <w:bCs/>
           <w:color w:val="004A67" w:themeColor="accent1" w:themeShade="80"/>
+          <w:sz w:val="20"/>
+          <w:szCs w:val="20"/>
           <w:lang w:val="en-GB"/>
         </w:rPr>
-        <w:t xml:space="preserve">Monash High Powered Rocketry (HPR), </w:t>
+        <w:t xml:space="preserve">Monash High Powered Rocketry (MHPR)                                                                                 </w:t>
       </w:r>
       <w:r>
         <w:rPr>
@@ -1150,22 +1095,24 @@
           <w:b/>
           <w:bCs/>
           <w:color w:val="004A67" w:themeColor="accent1" w:themeShade="80"/>
-          <w:lang w:val="en-GB"/>
-        </w:rPr>
-        <w:t>Monash University</w:t>
-      </w:r>
-    </w:p>
-    <w:p>
-      <w:pPr>
-        <w:rPr>
-          <w:rFonts w:asciiTheme="majorHAnsi" w:hAnsiTheme="majorHAnsi"/>
-          <w:i/>
-          <w:iCs/>
           <w:sz w:val="20"/>
           <w:szCs w:val="20"/>
           <w:lang w:val="en-GB"/>
         </w:rPr>
-      </w:pPr>
+        <w:t xml:space="preserve">                        </w:t>
+      </w:r>
+      <w:r>
+        <w:rPr>
+          <w:rFonts w:asciiTheme="majorHAnsi" w:hAnsiTheme="majorHAnsi"/>
+          <w:b/>
+          <w:bCs/>
+          <w:color w:val="004A67" w:themeColor="accent1" w:themeShade="80"/>
+          <w:sz w:val="20"/>
+          <w:szCs w:val="20"/>
+          <w:lang w:val="en-GB"/>
+        </w:rPr>
+        <w:t xml:space="preserve">    </w:t>
+      </w:r>
       <w:r>
         <w:rPr>
           <w:rFonts w:asciiTheme="majorHAnsi" w:hAnsiTheme="majorHAnsi"/>
@@ -1175,282 +1122,16 @@
           <w:szCs w:val="20"/>
           <w:lang w:val="en-GB"/>
         </w:rPr>
-        <w:t>Since September 2022</w:t>
+        <w:t>Since 2022</w:t>
       </w:r>
-    </w:p>
-    <w:p>
-      <w:pPr>
-        <w:pStyle w:val="ListParagraph"/>
-        <w:numPr>
-          <w:ilvl w:val="0"/>
-          <w:numId w:val="18"/>
-        </w:numPr>
-        <w:spacing w:line="276" w:lineRule="auto"/>
+      <w:r>
         <w:rPr>
           <w:rFonts w:asciiTheme="majorHAnsi" w:hAnsiTheme="majorHAnsi"/>
-          <w:color w:val="auto"/>
+          <w:i/>
+          <w:iCs/>
           <w:sz w:val="20"/>
           <w:szCs w:val="20"/>
           <w:lang w:val="en-GB"/>
-        </w:rPr>
-      </w:pPr>
-      <w:r>
-        <w:rPr>
-          <w:rFonts w:asciiTheme="majorHAnsi" w:eastAsia="Times New Roman" w:hAnsiTheme="majorHAnsi" w:cstheme="minorHAnsi"/>
-          <w:b/>
-          <w:bCs/>
-          <w:color w:val="004A67" w:themeColor="accent1" w:themeShade="80"/>
-          <w:sz w:val="20"/>
-          <w:szCs w:val="20"/>
-          <w:lang w:val="en-AU" w:eastAsia="zh-CN"/>
-        </w:rPr>
-        <w:t>Team lead</w:t>
-      </w:r>
-      <w:r>
-        <w:rPr>
-          <w:rFonts w:asciiTheme="majorHAnsi" w:eastAsia="Times New Roman" w:hAnsiTheme="majorHAnsi" w:cstheme="minorHAnsi"/>
-          <w:b/>
-          <w:bCs/>
-          <w:color w:val="004A67" w:themeColor="accent1" w:themeShade="80"/>
-          <w:sz w:val="20"/>
-          <w:szCs w:val="20"/>
-          <w:lang w:val="en-AU" w:eastAsia="zh-CN"/>
-        </w:rPr>
-        <w:t xml:space="preserve"> (CEO).</w:t>
-      </w:r>
-      <w:r>
-        <w:rPr>
-          <w:rFonts w:asciiTheme="majorHAnsi" w:eastAsia="Times New Roman" w:hAnsiTheme="majorHAnsi" w:cstheme="minorHAnsi"/>
-          <w:b/>
-          <w:bCs/>
-          <w:color w:val="004A67" w:themeColor="accent1" w:themeShade="80"/>
-          <w:sz w:val="20"/>
-          <w:szCs w:val="20"/>
-          <w:lang w:val="en-AU" w:eastAsia="zh-CN"/>
-        </w:rPr>
-        <w:t xml:space="preserve"> </w:t>
-      </w:r>
-      <w:r>
-        <w:rPr>
-          <w:rFonts w:asciiTheme="majorHAnsi" w:eastAsia="Times New Roman" w:hAnsiTheme="majorHAnsi" w:cstheme="minorHAnsi"/>
-          <w:color w:val="auto"/>
-          <w:sz w:val="20"/>
-          <w:szCs w:val="20"/>
-          <w:lang w:val="en-AU" w:eastAsia="zh-CN"/>
-        </w:rPr>
-        <w:t>Leading a team of over 150 students, both operationally and technically</w:t>
-      </w:r>
-      <w:r>
-        <w:rPr>
-          <w:rFonts w:asciiTheme="majorHAnsi" w:eastAsia="Times New Roman" w:hAnsiTheme="majorHAnsi" w:cstheme="minorHAnsi"/>
-          <w:color w:val="auto"/>
-          <w:sz w:val="20"/>
-          <w:szCs w:val="20"/>
-          <w:lang w:val="en-AU" w:eastAsia="zh-CN"/>
-        </w:rPr>
-        <w:t>.</w:t>
-      </w:r>
-      <w:r>
-        <w:rPr>
-          <w:rFonts w:asciiTheme="majorHAnsi" w:eastAsia="Times New Roman" w:hAnsiTheme="majorHAnsi" w:cstheme="minorHAnsi"/>
-          <w:color w:val="auto"/>
-          <w:sz w:val="20"/>
-          <w:szCs w:val="20"/>
-          <w:lang w:val="en-AU" w:eastAsia="zh-CN"/>
-        </w:rPr>
-        <w:t xml:space="preserve"> Working to instil a positive and inclusive culture.</w:t>
-      </w:r>
-    </w:p>
-    <w:p>
-      <w:pPr>
-        <w:pStyle w:val="ListParagraph"/>
-        <w:numPr>
-          <w:ilvl w:val="0"/>
-          <w:numId w:val="18"/>
-        </w:numPr>
-        <w:spacing w:line="276" w:lineRule="auto"/>
-        <w:rPr>
-          <w:rFonts w:asciiTheme="majorHAnsi" w:hAnsiTheme="majorHAnsi"/>
-          <w:color w:val="auto"/>
-          <w:sz w:val="20"/>
-          <w:szCs w:val="20"/>
-          <w:lang w:val="en-GB"/>
-        </w:rPr>
-      </w:pPr>
-      <w:r>
-        <w:rPr>
-          <w:rFonts w:asciiTheme="majorHAnsi" w:eastAsia="Times New Roman" w:hAnsiTheme="majorHAnsi" w:cstheme="minorHAnsi"/>
-          <w:color w:val="auto"/>
-          <w:sz w:val="20"/>
-          <w:szCs w:val="20"/>
-          <w:lang w:val="en-AU" w:eastAsia="zh-CN"/>
-        </w:rPr>
-        <w:t>Leading the team to</w:t>
-      </w:r>
-      <w:r>
-        <w:rPr>
-          <w:rFonts w:asciiTheme="majorHAnsi" w:eastAsia="Times New Roman" w:hAnsiTheme="majorHAnsi" w:cstheme="minorHAnsi"/>
-          <w:color w:val="auto"/>
-          <w:sz w:val="20"/>
-          <w:szCs w:val="20"/>
-          <w:lang w:val="en-AU" w:eastAsia="zh-CN"/>
-        </w:rPr>
-        <w:t xml:space="preserve"> a record altitude launch attempt in Australia (100k feet) and competing in the 10k feet SRAD category at the Australian Universities Rocket Competition.</w:t>
-      </w:r>
-    </w:p>
-    <w:p>
-      <w:pPr>
-        <w:pStyle w:val="ListParagraph"/>
-        <w:numPr>
-          <w:ilvl w:val="0"/>
-          <w:numId w:val="18"/>
-        </w:numPr>
-        <w:spacing w:line="276" w:lineRule="auto"/>
-        <w:rPr>
-          <w:rFonts w:asciiTheme="majorHAnsi" w:hAnsiTheme="majorHAnsi"/>
-          <w:color w:val="auto"/>
-          <w:sz w:val="20"/>
-          <w:szCs w:val="20"/>
-          <w:lang w:val="en-GB"/>
-        </w:rPr>
-      </w:pPr>
-      <w:r>
-        <w:rPr>
-          <w:rFonts w:asciiTheme="majorHAnsi" w:eastAsia="Times New Roman" w:hAnsiTheme="majorHAnsi" w:cstheme="minorHAnsi"/>
-          <w:color w:val="auto"/>
-          <w:sz w:val="20"/>
-          <w:szCs w:val="20"/>
-          <w:lang w:val="en-AU" w:eastAsia="zh-CN"/>
-        </w:rPr>
-        <w:t>Developing and executing the team’s long-term strategy, overseeing internal decision making and engaging with sponsors, faculty and media.</w:t>
-      </w:r>
-    </w:p>
-    <w:p>
-      <w:pPr>
-        <w:pStyle w:val="ListParagraph"/>
-        <w:numPr>
-          <w:ilvl w:val="0"/>
-          <w:numId w:val="18"/>
-        </w:numPr>
-        <w:spacing w:line="276" w:lineRule="auto"/>
-        <w:rPr>
-          <w:rFonts w:asciiTheme="majorHAnsi" w:hAnsiTheme="majorHAnsi"/>
-          <w:color w:val="004A67" w:themeColor="accent1" w:themeShade="80"/>
-          <w:sz w:val="20"/>
-          <w:szCs w:val="20"/>
-          <w:lang w:val="en-GB"/>
-        </w:rPr>
-      </w:pPr>
-      <w:r>
-        <w:rPr>
-          <w:rFonts w:asciiTheme="majorHAnsi" w:eastAsia="Times New Roman" w:hAnsiTheme="majorHAnsi" w:cstheme="minorHAnsi"/>
-          <w:b/>
-          <w:bCs/>
-          <w:color w:val="004A67" w:themeColor="accent1" w:themeShade="80"/>
-          <w:sz w:val="20"/>
-          <w:szCs w:val="20"/>
-          <w:lang w:val="en-AU" w:eastAsia="zh-CN"/>
-        </w:rPr>
-        <w:t>Propulsion lead</w:t>
-      </w:r>
-      <w:r>
-        <w:rPr>
-          <w:rFonts w:asciiTheme="majorHAnsi" w:eastAsia="Times New Roman" w:hAnsiTheme="majorHAnsi" w:cstheme="minorHAnsi"/>
-          <w:color w:val="004A67" w:themeColor="accent1" w:themeShade="80"/>
-          <w:sz w:val="20"/>
-          <w:szCs w:val="20"/>
-          <w:lang w:val="en-AU" w:eastAsia="zh-CN"/>
-        </w:rPr>
-        <w:t xml:space="preserve">. </w:t>
-      </w:r>
-      <w:r>
-        <w:rPr>
-          <w:rFonts w:asciiTheme="majorHAnsi" w:eastAsia="Times New Roman" w:hAnsiTheme="majorHAnsi" w:cstheme="minorHAnsi"/>
-          <w:color w:val="auto"/>
-          <w:sz w:val="20"/>
-          <w:szCs w:val="20"/>
-          <w:lang w:val="en-AU" w:eastAsia="zh-CN"/>
-        </w:rPr>
-        <w:t xml:space="preserve">Leading a team </w:t>
-      </w:r>
-      <w:r>
-        <w:rPr>
-          <w:rFonts w:asciiTheme="majorHAnsi" w:eastAsia="Times New Roman" w:hAnsiTheme="majorHAnsi" w:cstheme="minorHAnsi"/>
-          <w:color w:val="auto"/>
-          <w:sz w:val="20"/>
-          <w:szCs w:val="20"/>
-          <w:lang w:val="en-AU" w:eastAsia="zh-CN"/>
-        </w:rPr>
-        <w:t xml:space="preserve">of propulsion engineers </w:t>
-      </w:r>
-      <w:r>
-        <w:rPr>
-          <w:rFonts w:asciiTheme="majorHAnsi" w:eastAsia="Times New Roman" w:hAnsiTheme="majorHAnsi" w:cstheme="minorHAnsi"/>
-          <w:color w:val="auto"/>
-          <w:sz w:val="20"/>
-          <w:szCs w:val="20"/>
-          <w:lang w:val="en-AU" w:eastAsia="zh-CN"/>
-        </w:rPr>
-        <w:t>resulting in 2</w:t>
-      </w:r>
-      <w:r>
-        <w:rPr>
-          <w:rFonts w:asciiTheme="majorHAnsi" w:eastAsia="Times New Roman" w:hAnsiTheme="majorHAnsi" w:cstheme="minorHAnsi"/>
-          <w:color w:val="auto"/>
-          <w:sz w:val="20"/>
-          <w:szCs w:val="20"/>
-          <w:vertAlign w:val="superscript"/>
-          <w:lang w:val="en-AU" w:eastAsia="zh-CN"/>
-        </w:rPr>
-        <w:t>nd</w:t>
-      </w:r>
-      <w:r>
-        <w:rPr>
-          <w:rFonts w:asciiTheme="majorHAnsi" w:eastAsia="Times New Roman" w:hAnsiTheme="majorHAnsi" w:cstheme="minorHAnsi"/>
-          <w:color w:val="auto"/>
-          <w:sz w:val="20"/>
-          <w:szCs w:val="20"/>
-          <w:lang w:val="en-AU" w:eastAsia="zh-CN"/>
-        </w:rPr>
-        <w:t xml:space="preserve"> Place in</w:t>
-      </w:r>
-      <w:r>
-        <w:rPr>
-          <w:rFonts w:asciiTheme="majorHAnsi" w:eastAsia="Times New Roman" w:hAnsiTheme="majorHAnsi" w:cstheme="minorHAnsi"/>
-          <w:color w:val="auto"/>
-          <w:sz w:val="20"/>
-          <w:szCs w:val="20"/>
-          <w:lang w:val="en-AU" w:eastAsia="zh-CN"/>
-        </w:rPr>
-        <w:t xml:space="preserve"> category at the International Rocketry Engineering Competition (IREC) and the Jim Furfaro award for technical excellence</w:t>
-      </w:r>
-      <w:r>
-        <w:rPr>
-          <w:rFonts w:asciiTheme="majorHAnsi" w:eastAsia="Times New Roman" w:hAnsiTheme="majorHAnsi" w:cstheme="minorHAnsi"/>
-          <w:color w:val="auto"/>
-          <w:sz w:val="20"/>
-          <w:szCs w:val="20"/>
-          <w:lang w:val="en-AU" w:eastAsia="zh-CN"/>
-        </w:rPr>
-        <w:t xml:space="preserve"> out of over 140 teams internationally</w:t>
-      </w:r>
-      <w:r>
-        <w:rPr>
-          <w:rFonts w:asciiTheme="majorHAnsi" w:eastAsia="Times New Roman" w:hAnsiTheme="majorHAnsi" w:cstheme="minorHAnsi"/>
-          <w:color w:val="auto"/>
-          <w:sz w:val="20"/>
-          <w:szCs w:val="20"/>
-          <w:lang w:val="en-AU" w:eastAsia="zh-CN"/>
-        </w:rPr>
-        <w:t>.</w:t>
-      </w:r>
-      <w:r>
-        <w:rPr>
-          <w:rFonts w:asciiTheme="majorHAnsi" w:eastAsia="Times New Roman" w:hAnsiTheme="majorHAnsi" w:cstheme="minorHAnsi"/>
-          <w:color w:val="auto"/>
-          <w:sz w:val="20"/>
-          <w:szCs w:val="20"/>
-          <w:lang w:val="en-AU" w:eastAsia="zh-CN"/>
         </w:rPr>
         <w:t xml:space="preserve"> </w:t>
       </w:r>
@@ -1462,24 +1143,271 @@
           <w:ilvl w:val="0"/>
           <w:numId w:val="18"/>
         </w:numPr>
-        <w:spacing w:line="276" w:lineRule="auto"/>
+        <w:spacing w:before="0" w:after="100" w:afterAutospacing="1"/>
+        <w:rPr>
+          <w:rFonts w:asciiTheme="majorHAnsi" w:eastAsia="Times New Roman" w:hAnsiTheme="majorHAnsi" w:cs="Arial"/>
+          <w:color w:val="auto"/>
+          <w:sz w:val="20"/>
+          <w:szCs w:val="20"/>
+          <w:lang w:val="en-AU" w:eastAsia="zh-CN"/>
+        </w:rPr>
+      </w:pPr>
+      <w:r>
+        <w:rPr>
+          <w:rFonts w:asciiTheme="majorHAnsi" w:eastAsia="Times New Roman" w:hAnsiTheme="majorHAnsi" w:cs="Arial"/>
+          <w:b/>
+          <w:bCs/>
+          <w:color w:val="0D3C4E" w:themeColor="text2" w:themeTint="E6"/>
+          <w:sz w:val="20"/>
+          <w:szCs w:val="20"/>
+          <w:lang w:val="en-AU" w:eastAsia="zh-CN"/>
+        </w:rPr>
+        <w:t>Team Lead</w:t>
+      </w:r>
+      <w:r>
+        <w:rPr>
+          <w:rFonts w:asciiTheme="majorHAnsi" w:eastAsia="Times New Roman" w:hAnsiTheme="majorHAnsi" w:cs="Arial"/>
+          <w:color w:val="0D3C4E" w:themeColor="text2" w:themeTint="E6"/>
+          <w:sz w:val="20"/>
+          <w:szCs w:val="20"/>
+          <w:lang w:val="en-AU" w:eastAsia="zh-CN"/>
+        </w:rPr>
+        <w:t xml:space="preserve"> </w:t>
+      </w:r>
+      <w:r>
+        <w:rPr>
+          <w:rFonts w:asciiTheme="majorHAnsi" w:eastAsia="Times New Roman" w:hAnsiTheme="majorHAnsi" w:cs="Arial"/>
+          <w:color w:val="auto"/>
+          <w:sz w:val="20"/>
+          <w:szCs w:val="20"/>
+          <w:lang w:val="en-AU" w:eastAsia="zh-CN"/>
+        </w:rPr>
+        <w:t>(</w:t>
+      </w:r>
+      <w:r>
+        <w:rPr>
+          <w:rFonts w:asciiTheme="majorHAnsi" w:eastAsia="Times New Roman" w:hAnsiTheme="majorHAnsi" w:cs="Arial"/>
+          <w:i/>
+          <w:iCs/>
+          <w:color w:val="auto"/>
+          <w:sz w:val="20"/>
+          <w:szCs w:val="20"/>
+          <w:lang w:val="en-AU" w:eastAsia="zh-CN"/>
+        </w:rPr>
+        <w:t>2025–2026</w:t>
+      </w:r>
+      <w:r>
+        <w:rPr>
+          <w:rFonts w:asciiTheme="majorHAnsi" w:eastAsia="Times New Roman" w:hAnsiTheme="majorHAnsi" w:cs="Arial"/>
+          <w:color w:val="auto"/>
+          <w:sz w:val="20"/>
+          <w:szCs w:val="20"/>
+          <w:lang w:val="en-AU" w:eastAsia="zh-CN"/>
+        </w:rPr>
+        <w:t xml:space="preserve">): Directing 150+ students targeting </w:t>
+      </w:r>
+      <w:r>
+        <w:rPr>
+          <w:rFonts w:asciiTheme="majorHAnsi" w:eastAsia="Times New Roman" w:hAnsiTheme="majorHAnsi" w:cs="Arial"/>
+          <w:color w:val="auto"/>
+          <w:sz w:val="20"/>
+          <w:szCs w:val="20"/>
+          <w:lang w:val="en-AU" w:eastAsia="zh-CN"/>
+        </w:rPr>
+        <w:t xml:space="preserve">a </w:t>
+      </w:r>
+      <w:r>
+        <w:rPr>
+          <w:rFonts w:asciiTheme="majorHAnsi" w:eastAsia="Times New Roman" w:hAnsiTheme="majorHAnsi" w:cs="Arial"/>
+          <w:color w:val="auto"/>
+          <w:sz w:val="20"/>
+          <w:szCs w:val="20"/>
+          <w:lang w:val="en-AU" w:eastAsia="zh-CN"/>
+        </w:rPr>
+        <w:t>100,000 feet</w:t>
+      </w:r>
+      <w:r>
+        <w:rPr>
+          <w:rFonts w:asciiTheme="majorHAnsi" w:eastAsia="Times New Roman" w:hAnsiTheme="majorHAnsi" w:cs="Arial"/>
+          <w:color w:val="auto"/>
+          <w:sz w:val="20"/>
+          <w:szCs w:val="20"/>
+          <w:lang w:val="en-AU" w:eastAsia="zh-CN"/>
+        </w:rPr>
+        <w:t xml:space="preserve"> launch and competing in the AURC 10k ft SRAD category; secured over $85,000 in sponsorships. </w:t>
+      </w:r>
+    </w:p>
+    <w:p>
+      <w:pPr>
+        <w:pStyle w:val="ListParagraph"/>
+        <w:numPr>
+          <w:ilvl w:val="0"/>
+          <w:numId w:val="18"/>
+        </w:numPr>
+        <w:spacing w:before="0" w:after="100" w:afterAutospacing="1"/>
+        <w:rPr>
+          <w:rFonts w:asciiTheme="majorHAnsi" w:eastAsia="Times New Roman" w:hAnsiTheme="majorHAnsi" w:cs="Arial"/>
+          <w:color w:val="auto"/>
+          <w:sz w:val="20"/>
+          <w:szCs w:val="20"/>
+          <w:lang w:val="en-AU" w:eastAsia="zh-CN"/>
+        </w:rPr>
+      </w:pPr>
+      <w:r>
+        <w:rPr>
+          <w:rFonts w:asciiTheme="majorHAnsi" w:eastAsia="Times New Roman" w:hAnsiTheme="majorHAnsi" w:cs="Arial"/>
+          <w:b/>
+          <w:bCs/>
+          <w:color w:val="0D3C4E" w:themeColor="text2" w:themeTint="E6"/>
+          <w:sz w:val="20"/>
+          <w:szCs w:val="20"/>
+          <w:lang w:val="en-AU" w:eastAsia="zh-CN"/>
+        </w:rPr>
+        <w:t>Propulsion Lead</w:t>
+      </w:r>
+      <w:r>
+        <w:rPr>
+          <w:rFonts w:asciiTheme="majorHAnsi" w:eastAsia="Times New Roman" w:hAnsiTheme="majorHAnsi" w:cs="Arial"/>
+          <w:color w:val="0D3C4E" w:themeColor="text2" w:themeTint="E6"/>
+          <w:sz w:val="20"/>
+          <w:szCs w:val="20"/>
+          <w:lang w:val="en-AU" w:eastAsia="zh-CN"/>
+        </w:rPr>
+        <w:t xml:space="preserve"> </w:t>
+      </w:r>
+      <w:r>
+        <w:rPr>
+          <w:rFonts w:asciiTheme="majorHAnsi" w:eastAsia="Times New Roman" w:hAnsiTheme="majorHAnsi" w:cs="Arial"/>
+          <w:color w:val="auto"/>
+          <w:sz w:val="20"/>
+          <w:szCs w:val="20"/>
+          <w:lang w:val="en-AU" w:eastAsia="zh-CN"/>
+        </w:rPr>
+        <w:t>(</w:t>
+      </w:r>
+      <w:r>
+        <w:rPr>
+          <w:rFonts w:asciiTheme="majorHAnsi" w:eastAsia="Times New Roman" w:hAnsiTheme="majorHAnsi" w:cs="Arial"/>
+          <w:i/>
+          <w:iCs/>
+          <w:color w:val="auto"/>
+          <w:sz w:val="20"/>
+          <w:szCs w:val="20"/>
+          <w:lang w:val="en-AU" w:eastAsia="zh-CN"/>
+        </w:rPr>
+        <w:t>2024–2025</w:t>
+      </w:r>
+      <w:r>
+        <w:rPr>
+          <w:rFonts w:asciiTheme="majorHAnsi" w:eastAsia="Times New Roman" w:hAnsiTheme="majorHAnsi" w:cs="Arial"/>
+          <w:color w:val="auto"/>
+          <w:sz w:val="20"/>
+          <w:szCs w:val="20"/>
+          <w:lang w:val="en-AU" w:eastAsia="zh-CN"/>
+        </w:rPr>
+        <w:t>): Led design</w:t>
+      </w:r>
+      <w:r>
+        <w:rPr>
+          <w:rFonts w:asciiTheme="majorHAnsi" w:eastAsia="Times New Roman" w:hAnsiTheme="majorHAnsi" w:cs="Arial"/>
+          <w:color w:val="auto"/>
+          <w:sz w:val="20"/>
+          <w:szCs w:val="20"/>
+          <w:lang w:val="en-AU" w:eastAsia="zh-CN"/>
+        </w:rPr>
+        <w:t xml:space="preserve">, manufacture and test </w:t>
+      </w:r>
+      <w:r>
+        <w:rPr>
+          <w:rFonts w:asciiTheme="majorHAnsi" w:eastAsia="Times New Roman" w:hAnsiTheme="majorHAnsi" w:cs="Arial"/>
+          <w:color w:val="auto"/>
+          <w:sz w:val="20"/>
+          <w:szCs w:val="20"/>
+          <w:lang w:val="en-AU" w:eastAsia="zh-CN"/>
+        </w:rPr>
+        <w:t xml:space="preserve">of 3kN and 12kN (cryogenic liquid oxygen) hybrid engines, winning the IREC Jim Furfaro Award for Technical Excellence. </w:t>
+      </w:r>
+      <w:r>
+        <w:rPr>
+          <w:rFonts w:asciiTheme="majorHAnsi" w:eastAsia="Times New Roman" w:hAnsiTheme="majorHAnsi" w:cs="Arial"/>
+          <w:color w:val="auto"/>
+          <w:sz w:val="20"/>
+          <w:szCs w:val="20"/>
+          <w:lang w:val="en-AU" w:eastAsia="zh-CN"/>
+        </w:rPr>
+        <w:t>Includes all ground support equipment and test infrastructure.</w:t>
+      </w:r>
+    </w:p>
+    <w:p>
+      <w:pPr>
+        <w:pStyle w:val="ListParagraph"/>
+        <w:numPr>
+          <w:ilvl w:val="0"/>
+          <w:numId w:val="18"/>
+        </w:numPr>
+        <w:spacing w:before="0" w:after="120"/>
+        <w:ind w:left="357" w:hanging="357"/>
+        <w:rPr>
+          <w:rFonts w:asciiTheme="majorHAnsi" w:eastAsia="Times New Roman" w:hAnsiTheme="majorHAnsi" w:cs="Arial"/>
+          <w:color w:val="auto"/>
+          <w:sz w:val="20"/>
+          <w:szCs w:val="20"/>
+          <w:lang w:val="en-AU" w:eastAsia="zh-CN"/>
+        </w:rPr>
+      </w:pPr>
+      <w:r>
+        <w:rPr>
+          <w:rFonts w:asciiTheme="majorHAnsi" w:eastAsia="Times New Roman" w:hAnsiTheme="majorHAnsi" w:cs="Arial"/>
+          <w:color w:val="auto"/>
+          <w:sz w:val="20"/>
+          <w:szCs w:val="20"/>
+          <w:lang w:val="en-AU" w:eastAsia="zh-CN"/>
+        </w:rPr>
+        <w:t xml:space="preserve">Engineered composite over-wrapped pressure vessels, regeneratively cooled nozzles, and custom pneumatic oxidiser systems, taking </w:t>
+      </w:r>
+      <w:r>
+        <w:rPr>
+          <w:rFonts w:asciiTheme="majorHAnsi" w:eastAsia="Times New Roman" w:hAnsiTheme="majorHAnsi" w:cs="Arial"/>
+          <w:color w:val="auto"/>
+          <w:sz w:val="20"/>
+          <w:szCs w:val="20"/>
+          <w:lang w:val="en-AU" w:eastAsia="zh-CN"/>
+        </w:rPr>
+        <w:t>hardware</w:t>
+      </w:r>
+      <w:r>
+        <w:rPr>
+          <w:rFonts w:asciiTheme="majorHAnsi" w:eastAsia="Times New Roman" w:hAnsiTheme="majorHAnsi" w:cs="Arial"/>
+          <w:color w:val="auto"/>
+          <w:sz w:val="20"/>
+          <w:szCs w:val="20"/>
+          <w:lang w:val="en-AU" w:eastAsia="zh-CN"/>
+        </w:rPr>
+        <w:t xml:space="preserve"> from concept to completion. </w:t>
+      </w:r>
+    </w:p>
+    <w:p>
+      <w:pPr>
+        <w:spacing w:before="0"/>
         <w:rPr>
           <w:rFonts w:asciiTheme="majorHAnsi" w:hAnsiTheme="majorHAnsi"/>
+          <w:b/>
+          <w:bCs/>
           <w:color w:val="004A67" w:themeColor="accent1" w:themeShade="80"/>
-          <w:sz w:val="20"/>
-          <w:szCs w:val="20"/>
           <w:lang w:val="en-GB"/>
         </w:rPr>
       </w:pPr>
       <w:r>
         <w:rPr>
           <w:rFonts w:asciiTheme="majorHAnsi" w:hAnsiTheme="majorHAnsi"/>
-          <w:color w:val="auto"/>
+          <w:b/>
+          <w:bCs/>
+          <w:color w:val="004A67" w:themeColor="accent1" w:themeShade="80"/>
           <w:sz w:val="20"/>
           <w:szCs w:val="20"/>
           <w:lang w:val="en-GB"/>
         </w:rPr>
-        <w:t xml:space="preserve">Led designs for two </w:t>
+        <w:t>Hydrogen Jet Facility, Final Year Project</w:t>
       </w:r>
       <w:r>
         <w:rPr>
@@ -1491,17 +1419,42 @@
           <w:szCs w:val="20"/>
           <w:lang w:val="en-GB"/>
         </w:rPr>
-        <w:t>3kN and 12kN hybrid rocket engines</w:t>
+        <w:t xml:space="preserve">                                                                            </w:t>
       </w:r>
       <w:r>
         <w:rPr>
           <w:rFonts w:asciiTheme="majorHAnsi" w:hAnsiTheme="majorHAnsi"/>
-          <w:color w:val="auto"/>
+          <w:b/>
+          <w:bCs/>
+          <w:color w:val="004A67" w:themeColor="accent1" w:themeShade="80"/>
           <w:sz w:val="20"/>
           <w:szCs w:val="20"/>
           <w:lang w:val="en-GB"/>
         </w:rPr>
-        <w:t>, the latter using cryogenic liquid oxygen</w:t>
+        <w:t xml:space="preserve">                </w:t>
+      </w:r>
+      <w:r>
+        <w:rPr>
+          <w:rFonts w:asciiTheme="majorHAnsi" w:hAnsiTheme="majorHAnsi"/>
+          <w:b/>
+          <w:bCs/>
+          <w:color w:val="004A67" w:themeColor="accent1" w:themeShade="80"/>
+          <w:sz w:val="20"/>
+          <w:szCs w:val="20"/>
+          <w:lang w:val="en-GB"/>
+        </w:rPr>
+        <w:t xml:space="preserve">    </w:t>
+      </w:r>
+      <w:r>
+        <w:rPr>
+          <w:rFonts w:asciiTheme="majorHAnsi" w:hAnsiTheme="majorHAnsi"/>
+          <w:i/>
+          <w:iCs/>
+          <w:sz w:val="20"/>
+          <w:szCs w:val="20"/>
+          <w:lang w:val="en-GB"/>
+        </w:rPr>
+        <w:t>2026 – 2 semesters</w:t>
       </w:r>
     </w:p>
     <w:p>
@@ -1509,95 +1462,9 @@
         <w:pStyle w:val="ListParagraph"/>
         <w:numPr>
           <w:ilvl w:val="0"/>
-          <w:numId w:val="18"/>
+          <w:numId w:val="14"/>
         </w:numPr>
-        <w:spacing w:line="276" w:lineRule="auto"/>
-        <w:rPr>
-          <w:rFonts w:asciiTheme="majorHAnsi" w:hAnsiTheme="majorHAnsi"/>
-          <w:color w:val="004A67" w:themeColor="accent1" w:themeShade="80"/>
-          <w:sz w:val="20"/>
-          <w:szCs w:val="20"/>
-          <w:lang w:val="en-GB"/>
-        </w:rPr>
-      </w:pPr>
-      <w:r>
-        <w:rPr>
-          <w:rFonts w:asciiTheme="majorHAnsi" w:eastAsia="Times New Roman" w:hAnsiTheme="majorHAnsi" w:cstheme="minorHAnsi"/>
-          <w:color w:val="auto"/>
-          <w:sz w:val="20"/>
-          <w:szCs w:val="20"/>
-          <w:lang w:val="en-AU" w:eastAsia="zh-CN"/>
-        </w:rPr>
-        <w:t>Acquired</w:t>
-      </w:r>
-      <w:r>
-        <w:rPr>
-          <w:rFonts w:asciiTheme="majorHAnsi" w:eastAsia="Times New Roman" w:hAnsiTheme="majorHAnsi" w:cstheme="minorHAnsi"/>
-          <w:color w:val="auto"/>
-          <w:sz w:val="20"/>
-          <w:szCs w:val="20"/>
-          <w:lang w:val="en-AU" w:eastAsia="zh-CN"/>
-        </w:rPr>
-        <w:t xml:space="preserve"> $21000 AUD in funding for the team to travel to the UK to compete in the largest propulsion competition in the world, setting a thrust record.</w:t>
-      </w:r>
-    </w:p>
-    <w:p>
-      <w:pPr>
-        <w:pStyle w:val="ListParagraph"/>
-        <w:numPr>
-          <w:ilvl w:val="0"/>
-          <w:numId w:val="18"/>
-        </w:numPr>
-        <w:spacing w:line="276" w:lineRule="auto"/>
-        <w:rPr>
-          <w:rFonts w:asciiTheme="majorHAnsi" w:hAnsiTheme="majorHAnsi"/>
-          <w:color w:val="auto"/>
-          <w:sz w:val="20"/>
-          <w:szCs w:val="20"/>
-          <w:lang w:val="en-GB"/>
-        </w:rPr>
-      </w:pPr>
-      <w:r>
-        <w:rPr>
-          <w:rFonts w:asciiTheme="majorHAnsi" w:eastAsia="Times New Roman" w:hAnsiTheme="majorHAnsi" w:cstheme="minorHAnsi"/>
-          <w:b/>
-          <w:bCs/>
-          <w:color w:val="004A67" w:themeColor="accent1" w:themeShade="80"/>
-          <w:sz w:val="20"/>
-          <w:szCs w:val="20"/>
-          <w:lang w:val="en-AU" w:eastAsia="zh-CN"/>
-        </w:rPr>
-        <w:t>Propulsion engineer.</w:t>
-      </w:r>
-      <w:r>
-        <w:rPr>
-          <w:rFonts w:asciiTheme="majorHAnsi" w:hAnsiTheme="majorHAnsi"/>
-          <w:color w:val="auto"/>
-          <w:sz w:val="20"/>
-          <w:szCs w:val="20"/>
-          <w:lang w:val="en-GB"/>
-        </w:rPr>
-        <w:t xml:space="preserve"> Resultant experiences with fluidics, thermodynamic simulations, multiphase CFD</w:t>
-      </w:r>
-      <w:r>
-        <w:rPr>
-          <w:rFonts w:asciiTheme="majorHAnsi" w:hAnsiTheme="majorHAnsi"/>
-          <w:color w:val="auto"/>
-          <w:sz w:val="20"/>
-          <w:szCs w:val="20"/>
-          <w:lang w:val="en-GB"/>
-        </w:rPr>
-        <w:t xml:space="preserve">. </w:t>
-      </w:r>
-    </w:p>
-    <w:p>
-      <w:pPr>
-        <w:pStyle w:val="ListParagraph"/>
-        <w:numPr>
-          <w:ilvl w:val="0"/>
-          <w:numId w:val="18"/>
-        </w:numPr>
-        <w:spacing w:line="276" w:lineRule="auto"/>
+        <w:spacing w:before="0" w:line="276" w:lineRule="auto"/>
         <w:rPr>
           <w:rFonts w:asciiTheme="majorHAnsi" w:hAnsiTheme="majorHAnsi"/>
           <w:color w:val="auto"/>
@@ -1614,184 +1481,7 @@
           <w:szCs w:val="20"/>
           <w:lang w:val="en-GB"/>
         </w:rPr>
-        <w:t>Design experience in</w:t>
-      </w:r>
-      <w:r>
-        <w:rPr>
-          <w:rFonts w:asciiTheme="majorHAnsi" w:hAnsiTheme="majorHAnsi"/>
-          <w:color w:val="auto"/>
-          <w:sz w:val="20"/>
-          <w:szCs w:val="20"/>
-          <w:lang w:val="en-GB"/>
-        </w:rPr>
-        <w:t xml:space="preserve"> </w:t>
-      </w:r>
-      <w:r>
-        <w:rPr>
-          <w:rFonts w:asciiTheme="majorHAnsi" w:hAnsiTheme="majorHAnsi"/>
-          <w:color w:val="auto"/>
-          <w:sz w:val="20"/>
-          <w:szCs w:val="20"/>
-          <w:lang w:val="en-GB"/>
-        </w:rPr>
-        <w:t>composite over-wrapped pressure vessels, regeneratively cooled nozzles, injector design</w:t>
-      </w:r>
-      <w:r>
-        <w:rPr>
-          <w:rFonts w:asciiTheme="majorHAnsi" w:hAnsiTheme="majorHAnsi"/>
-          <w:color w:val="auto"/>
-          <w:sz w:val="20"/>
-          <w:szCs w:val="20"/>
-          <w:lang w:val="en-GB"/>
-        </w:rPr>
-        <w:t xml:space="preserve"> and structural design for the engines and a vertical test stand and oxidiser fluid systems such as </w:t>
-      </w:r>
-      <w:r>
-        <w:rPr>
-          <w:rFonts w:asciiTheme="majorHAnsi" w:hAnsiTheme="majorHAnsi"/>
-          <w:color w:val="auto"/>
-          <w:sz w:val="20"/>
-          <w:szCs w:val="20"/>
-          <w:lang w:val="en-GB"/>
-        </w:rPr>
-        <w:t xml:space="preserve">custom </w:t>
-      </w:r>
-      <w:r>
-        <w:rPr>
-          <w:rFonts w:asciiTheme="majorHAnsi" w:hAnsiTheme="majorHAnsi"/>
-          <w:color w:val="auto"/>
-          <w:sz w:val="20"/>
-          <w:szCs w:val="20"/>
-          <w:lang w:val="en-GB"/>
-        </w:rPr>
-        <w:t>pneumatic v</w:t>
-      </w:r>
-      <w:r>
-        <w:rPr>
-          <w:rFonts w:asciiTheme="majorHAnsi" w:hAnsiTheme="majorHAnsi"/>
-          <w:color w:val="auto"/>
-          <w:sz w:val="20"/>
-          <w:szCs w:val="20"/>
-          <w:lang w:val="en-GB"/>
-        </w:rPr>
-        <w:t>alves and fluid lines.</w:t>
-      </w:r>
-    </w:p>
-    <w:p>
-      <w:pPr>
-        <w:rPr>
-          <w:rFonts w:asciiTheme="majorHAnsi" w:hAnsiTheme="majorHAnsi"/>
-          <w:b/>
-          <w:bCs/>
-          <w:color w:val="004A67" w:themeColor="accent1" w:themeShade="80"/>
-          <w:lang w:val="en-GB"/>
-        </w:rPr>
-      </w:pPr>
-      <w:r>
-        <w:rPr>
-          <w:rFonts w:asciiTheme="majorHAnsi" w:hAnsiTheme="majorHAnsi"/>
-          <w:b/>
-          <w:bCs/>
-          <w:color w:val="004A67" w:themeColor="accent1" w:themeShade="80"/>
-          <w:lang w:val="en-GB"/>
-        </w:rPr>
-        <w:t>Hydrogen Jet Facility, Final Year Project</w:t>
-      </w:r>
-    </w:p>
-    <w:p>
-      <w:pPr>
-        <w:rPr>
-          <w:rFonts w:asciiTheme="majorHAnsi" w:hAnsiTheme="majorHAnsi"/>
-          <w:i/>
-          <w:iCs/>
-          <w:sz w:val="20"/>
-          <w:szCs w:val="20"/>
-          <w:lang w:val="en-GB"/>
-        </w:rPr>
-      </w:pPr>
-      <w:r>
-        <w:rPr>
-          <w:rFonts w:asciiTheme="majorHAnsi" w:hAnsiTheme="majorHAnsi"/>
-          <w:i/>
-          <w:iCs/>
-          <w:sz w:val="20"/>
-          <w:szCs w:val="20"/>
-          <w:lang w:val="en-GB"/>
-        </w:rPr>
-        <w:t>2026</w:t>
-      </w:r>
-      <w:r>
-        <w:rPr>
-          <w:rFonts w:asciiTheme="majorHAnsi" w:hAnsiTheme="majorHAnsi"/>
-          <w:i/>
-          <w:iCs/>
-          <w:sz w:val="20"/>
-          <w:szCs w:val="20"/>
-          <w:lang w:val="en-GB"/>
-        </w:rPr>
-        <w:t xml:space="preserve"> – </w:t>
-      </w:r>
-      <w:r>
-        <w:rPr>
-          <w:rFonts w:asciiTheme="majorHAnsi" w:hAnsiTheme="majorHAnsi"/>
-          <w:i/>
-          <w:iCs/>
-          <w:sz w:val="20"/>
-          <w:szCs w:val="20"/>
-          <w:lang w:val="en-GB"/>
-        </w:rPr>
-        <w:t>2 semesters</w:t>
-      </w:r>
-    </w:p>
-    <w:p>
-      <w:pPr>
-        <w:pStyle w:val="ListParagraph"/>
-        <w:numPr>
-          <w:ilvl w:val="0"/>
-          <w:numId w:val="14"/>
-        </w:numPr>
-        <w:spacing w:line="276" w:lineRule="auto"/>
-        <w:rPr>
-          <w:rFonts w:asciiTheme="majorHAnsi" w:hAnsiTheme="majorHAnsi"/>
-          <w:b/>
-          <w:bCs/>
-          <w:color w:val="auto"/>
-          <w:sz w:val="20"/>
-          <w:szCs w:val="20"/>
-          <w:lang w:val="en-GB"/>
-        </w:rPr>
-      </w:pPr>
-      <w:r>
-        <w:rPr>
-          <w:rFonts w:asciiTheme="majorHAnsi" w:hAnsiTheme="majorHAnsi"/>
-          <w:b/>
-          <w:bCs/>
-          <w:color w:val="004A67" w:themeColor="accent1" w:themeShade="80"/>
-          <w:sz w:val="20"/>
-          <w:szCs w:val="20"/>
-          <w:lang w:val="en-GB"/>
-        </w:rPr>
-        <w:t xml:space="preserve">Design, build and commission </w:t>
-      </w:r>
-      <w:r>
-        <w:rPr>
-          <w:rFonts w:asciiTheme="majorHAnsi" w:hAnsiTheme="majorHAnsi"/>
-          <w:color w:val="auto"/>
-          <w:sz w:val="20"/>
-          <w:szCs w:val="20"/>
-          <w:lang w:val="en-GB"/>
-        </w:rPr>
-        <w:t xml:space="preserve">of a hydrogen </w:t>
-      </w:r>
-      <w:r>
-        <w:rPr>
-          <w:rFonts w:asciiTheme="majorHAnsi" w:hAnsiTheme="majorHAnsi"/>
-          <w:color w:val="auto"/>
-          <w:sz w:val="20"/>
-          <w:szCs w:val="20"/>
-          <w:lang w:val="en-GB"/>
-        </w:rPr>
-        <w:t xml:space="preserve">jet facility at Monash University. </w:t>
+        <w:t xml:space="preserve">Design, build and commission of a hydrogen jet facility at Monash University. </w:t>
       </w:r>
       <w:r>
         <w:rPr>
@@ -1811,64 +1501,9 @@
           <w:ilvl w:val="0"/>
           <w:numId w:val="14"/>
         </w:numPr>
-        <w:spacing w:line="276" w:lineRule="auto"/>
+        <w:spacing w:before="0" w:line="276" w:lineRule="auto"/>
         <w:rPr>
           <w:rFonts w:asciiTheme="majorHAnsi" w:hAnsiTheme="majorHAnsi"/>
-          <w:b/>
-          <w:bCs/>
-          <w:color w:val="auto"/>
-          <w:sz w:val="20"/>
-          <w:szCs w:val="20"/>
-          <w:lang w:val="en-GB"/>
-        </w:rPr>
-      </w:pPr>
-      <w:r>
-        <w:rPr>
-          <w:rFonts w:asciiTheme="majorHAnsi" w:hAnsiTheme="majorHAnsi"/>
-          <w:b/>
-          <w:bCs/>
-          <w:color w:val="004A67" w:themeColor="accent1" w:themeShade="80"/>
-          <w:sz w:val="20"/>
-          <w:szCs w:val="20"/>
-          <w:lang w:val="en-GB"/>
-        </w:rPr>
-        <w:t>Investigating supersonic hydrogen jet leaks with acoustics</w:t>
-      </w:r>
-      <w:r>
-        <w:rPr>
-          <w:rFonts w:asciiTheme="majorHAnsi" w:hAnsiTheme="majorHAnsi"/>
-          <w:b/>
-          <w:bCs/>
-          <w:color w:val="004A67" w:themeColor="accent1" w:themeShade="80"/>
-          <w:sz w:val="20"/>
-          <w:szCs w:val="20"/>
-          <w:lang w:val="en-GB"/>
-        </w:rPr>
-        <w:t xml:space="preserve"> </w:t>
-      </w:r>
-      <w:r>
-        <w:rPr>
-          <w:rFonts w:asciiTheme="majorHAnsi" w:hAnsiTheme="majorHAnsi"/>
-          <w:color w:val="auto"/>
-          <w:sz w:val="20"/>
-          <w:szCs w:val="20"/>
-          <w:lang w:val="en-GB"/>
-        </w:rPr>
-        <w:t>involving the use of high speed schlieren imaging techniques and subsequent analysis.</w:t>
-      </w:r>
-    </w:p>
-    <w:p>
-      <w:pPr>
-        <w:pStyle w:val="ListParagraph"/>
-        <w:numPr>
-          <w:ilvl w:val="0"/>
-          <w:numId w:val="14"/>
-        </w:numPr>
-        <w:spacing w:line="276" w:lineRule="auto"/>
-        <w:rPr>
-          <w:rFonts w:asciiTheme="majorHAnsi" w:hAnsiTheme="majorHAnsi"/>
-          <w:b/>
-          <w:bCs/>
           <w:color w:val="auto"/>
           <w:sz w:val="20"/>
           <w:szCs w:val="20"/>
@@ -1883,7 +1518,7 @@
           <w:szCs w:val="20"/>
           <w:lang w:val="en-GB"/>
         </w:rPr>
-        <w:t xml:space="preserve">Key issue is making a safe and reliable system </w:t>
+        <w:t>Investigating supersonic hydrogen jet leaks with acoustics</w:t>
       </w:r>
       <w:r>
         <w:rPr>
@@ -1893,17 +1528,7 @@
           <w:szCs w:val="20"/>
           <w:lang w:val="en-GB"/>
         </w:rPr>
-        <w:t xml:space="preserve">with appropriate emergency controls to account for all scenarios such that the facility can be used frequently </w:t>
-      </w:r>
-      <w:r>
-        <w:rPr>
-          <w:rFonts w:asciiTheme="majorHAnsi" w:hAnsiTheme="majorHAnsi"/>
-          <w:color w:val="auto"/>
-          <w:sz w:val="20"/>
-          <w:szCs w:val="20"/>
-          <w:lang w:val="en-GB"/>
-        </w:rPr>
-        <w:t>by a variety of different researchers.</w:t>
+        <w:t xml:space="preserve"> involving the use of high speed schlieren imaging techniques and subsequent analysis.</w:t>
       </w:r>
     </w:p>
     <w:p>
@@ -1922,22 +1547,60 @@
           <w:b/>
           <w:bCs/>
           <w:color w:val="004A67" w:themeColor="accent1" w:themeShade="80"/>
+          <w:sz w:val="20"/>
+          <w:szCs w:val="20"/>
           <w:lang w:val="en-GB"/>
         </w:rPr>
         <w:t>Liquid Rocket Engine Project</w:t>
       </w:r>
-    </w:p>
-    <w:p>
-      <w:pPr>
+      <w:r>
         <w:rPr>
           <w:rFonts w:asciiTheme="majorHAnsi" w:hAnsiTheme="majorHAnsi"/>
-          <w:i/>
-          <w:iCs/>
+          <w:b/>
+          <w:bCs/>
+          <w:color w:val="004A67" w:themeColor="accent1" w:themeShade="80"/>
           <w:sz w:val="20"/>
           <w:szCs w:val="20"/>
           <w:lang w:val="en-GB"/>
         </w:rPr>
-      </w:pPr>
+        <w:t xml:space="preserve">                                                         </w:t>
+      </w:r>
+      <w:r>
+        <w:rPr>
+          <w:rFonts w:asciiTheme="majorHAnsi" w:hAnsiTheme="majorHAnsi"/>
+          <w:b/>
+          <w:bCs/>
+          <w:color w:val="004A67" w:themeColor="accent1" w:themeShade="80"/>
+          <w:sz w:val="20"/>
+          <w:szCs w:val="20"/>
+          <w:lang w:val="en-GB"/>
+        </w:rPr>
+        <w:t xml:space="preserve">                                   </w:t>
+      </w:r>
+      <w:r>
+        <w:rPr>
+          <w:rFonts w:asciiTheme="majorHAnsi" w:hAnsiTheme="majorHAnsi"/>
+          <w:b/>
+          <w:bCs/>
+          <w:color w:val="004A67" w:themeColor="accent1" w:themeShade="80"/>
+          <w:sz w:val="20"/>
+          <w:szCs w:val="20"/>
+          <w:lang w:val="en-GB"/>
+        </w:rPr>
+        <w:t xml:space="preserve">                </w:t>
+      </w:r>
+      <w:r>
+        <w:rPr>
+          <w:rFonts w:asciiTheme="majorHAnsi" w:hAnsiTheme="majorHAnsi"/>
+          <w:b/>
+          <w:bCs/>
+          <w:color w:val="004A67" w:themeColor="accent1" w:themeShade="80"/>
+          <w:sz w:val="20"/>
+          <w:szCs w:val="20"/>
+          <w:lang w:val="en-GB"/>
+        </w:rPr>
+        <w:t xml:space="preserve">   </w:t>
+      </w:r>
       <w:r>
         <w:rPr>
           <w:rFonts w:asciiTheme="majorHAnsi" w:hAnsiTheme="majorHAnsi"/>
@@ -1990,7 +1653,7 @@
           <w:ilvl w:val="0"/>
           <w:numId w:val="14"/>
         </w:numPr>
-        <w:spacing w:line="276" w:lineRule="auto"/>
+        <w:spacing w:before="0" w:line="276" w:lineRule="auto"/>
         <w:rPr>
           <w:rFonts w:asciiTheme="majorHAnsi" w:hAnsiTheme="majorHAnsi"/>
           <w:b/>
@@ -2001,79 +1664,6 @@
           <w:lang w:val="en-GB"/>
         </w:rPr>
       </w:pPr>
-      <w:r>
-        <w:rPr>
-          <w:rFonts w:asciiTheme="majorHAnsi" w:hAnsiTheme="majorHAnsi"/>
-          <w:b/>
-          <w:bCs/>
-          <w:color w:val="004A67" w:themeColor="accent1" w:themeShade="80"/>
-          <w:sz w:val="20"/>
-          <w:szCs w:val="20"/>
-          <w:lang w:val="en-GB"/>
-        </w:rPr>
-        <w:lastRenderedPageBreak/>
-        <w:t xml:space="preserve">Nitrous </w:t>
-      </w:r>
-      <w:r>
-        <w:rPr>
-          <w:rFonts w:asciiTheme="majorHAnsi" w:hAnsiTheme="majorHAnsi"/>
-          <w:b/>
-          <w:bCs/>
-          <w:color w:val="004A67" w:themeColor="accent1" w:themeShade="80"/>
-          <w:sz w:val="20"/>
-          <w:szCs w:val="20"/>
-          <w:lang w:val="en-GB"/>
-        </w:rPr>
-        <w:t>o</w:t>
-      </w:r>
-      <w:r>
-        <w:rPr>
-          <w:rFonts w:asciiTheme="majorHAnsi" w:hAnsiTheme="majorHAnsi"/>
-          <w:b/>
-          <w:bCs/>
-          <w:color w:val="004A67" w:themeColor="accent1" w:themeShade="80"/>
-          <w:sz w:val="20"/>
-          <w:szCs w:val="20"/>
-          <w:lang w:val="en-GB"/>
-        </w:rPr>
-        <w:t xml:space="preserve">xide </w:t>
-      </w:r>
-      <w:r>
-        <w:rPr>
-          <w:rFonts w:asciiTheme="majorHAnsi" w:hAnsiTheme="majorHAnsi"/>
-          <w:b/>
-          <w:bCs/>
-          <w:color w:val="004A67" w:themeColor="accent1" w:themeShade="80"/>
-          <w:sz w:val="20"/>
-          <w:szCs w:val="20"/>
-          <w:lang w:val="en-GB"/>
-        </w:rPr>
-        <w:t>f</w:t>
-      </w:r>
-      <w:r>
-        <w:rPr>
-          <w:rFonts w:asciiTheme="majorHAnsi" w:hAnsiTheme="majorHAnsi"/>
-          <w:b/>
-          <w:bCs/>
-          <w:color w:val="004A67" w:themeColor="accent1" w:themeShade="80"/>
-          <w:sz w:val="20"/>
-          <w:szCs w:val="20"/>
-          <w:lang w:val="en-GB"/>
-        </w:rPr>
-        <w:t>ill GSE</w:t>
-      </w:r>
-      <w:r>
-        <w:rPr>
-          <w:rFonts w:asciiTheme="majorHAnsi" w:hAnsiTheme="majorHAnsi"/>
-          <w:b/>
-          <w:bCs/>
-          <w:color w:val="004A67" w:themeColor="accent1" w:themeShade="80"/>
-          <w:sz w:val="20"/>
-          <w:szCs w:val="20"/>
-          <w:lang w:val="en-GB"/>
-        </w:rPr>
-        <w:t xml:space="preserve"> </w:t>
-      </w:r>
       <w:r>
         <w:rPr>
           <w:rFonts w:asciiTheme="majorHAnsi" w:hAnsiTheme="majorHAnsi"/>
@@ -2092,7 +1682,7 @@
           <w:szCs w:val="20"/>
           <w:lang w:val="en-GB"/>
         </w:rPr>
-        <w:t xml:space="preserve"> including fluids, housing, custom PCB, complete networking with live data</w:t>
+        <w:t xml:space="preserve"> including fluids, housing, custom PCB, </w:t>
       </w:r>
       <w:r>
         <w:rPr>
@@ -2102,17 +1692,7 @@
           <w:szCs w:val="20"/>
           <w:lang w:val="en-GB"/>
         </w:rPr>
-        <w:t xml:space="preserve"> including pressure, temperature, load cell thrust,</w:t>
-      </w:r>
-      <w:r>
-        <w:rPr>
-          <w:rFonts w:asciiTheme="majorHAnsi" w:hAnsiTheme="majorHAnsi"/>
-          <w:color w:val="auto"/>
-          <w:sz w:val="20"/>
-          <w:szCs w:val="20"/>
-          <w:lang w:val="en-GB"/>
-        </w:rPr>
-        <w:t xml:space="preserve"> camera feed and logging.</w:t>
+        <w:t>complete networking and DAQ.</w:t>
       </w:r>
     </w:p>
     <w:p>
@@ -2122,7 +1702,42 @@
           <w:ilvl w:val="0"/>
           <w:numId w:val="14"/>
         </w:numPr>
-        <w:spacing w:line="276" w:lineRule="auto"/>
+        <w:spacing w:before="0" w:line="276" w:lineRule="auto"/>
+        <w:rPr>
+          <w:rFonts w:asciiTheme="majorHAnsi" w:hAnsiTheme="majorHAnsi"/>
+          <w:color w:val="auto"/>
+          <w:sz w:val="20"/>
+          <w:szCs w:val="20"/>
+          <w:lang w:val="en-GB"/>
+        </w:rPr>
+      </w:pPr>
+      <w:r>
+        <w:rPr>
+          <w:rFonts w:asciiTheme="majorHAnsi" w:hAnsiTheme="majorHAnsi"/>
+          <w:color w:val="auto"/>
+          <w:sz w:val="20"/>
+          <w:szCs w:val="20"/>
+        </w:rPr>
+        <w:t>Design to test of a N2O/IPA engine</w:t>
+      </w:r>
+      <w:r>
+        <w:rPr>
+          <w:rFonts w:asciiTheme="majorHAnsi" w:hAnsiTheme="majorHAnsi"/>
+          <w:color w:val="auto"/>
+          <w:sz w:val="20"/>
+          <w:szCs w:val="20"/>
+        </w:rPr>
+        <w:t xml:space="preserve"> featuring a custom pyro-actuated Urbanski-Colburn valve and pintle injector.</w:t>
+      </w:r>
+    </w:p>
+    <w:p>
+      <w:pPr>
+        <w:pStyle w:val="ListParagraph"/>
+        <w:numPr>
+          <w:ilvl w:val="0"/>
+          <w:numId w:val="14"/>
+        </w:numPr>
+        <w:spacing w:before="0" w:line="276" w:lineRule="auto"/>
         <w:rPr>
           <w:rFonts w:asciiTheme="majorHAnsi" w:hAnsiTheme="majorHAnsi"/>
           <w:b/>
@@ -2136,14 +1751,12 @@
       <w:r>
         <w:rPr>
           <w:rFonts w:asciiTheme="majorHAnsi" w:hAnsiTheme="majorHAnsi"/>
-          <w:b/>
-          <w:bCs/>
-          <w:color w:val="004A67" w:themeColor="accent1" w:themeShade="80"/>
+          <w:color w:val="auto"/>
           <w:sz w:val="20"/>
           <w:szCs w:val="20"/>
           <w:lang w:val="en-GB"/>
         </w:rPr>
-        <w:t xml:space="preserve">Pyro actuated main valve </w:t>
+        <w:t>Characterised valve and injector empirical discharges</w:t>
       </w:r>
       <w:r>
         <w:rPr>
@@ -2153,17 +1766,7 @@
           <w:szCs w:val="20"/>
           <w:lang w:val="en-GB"/>
         </w:rPr>
-        <w:t xml:space="preserve">Urbanski-Colburn style valve but designed to use a single nitrous fill line and pyro charge to open </w:t>
-      </w:r>
-      <w:r>
-        <w:rPr>
-          <w:rFonts w:asciiTheme="majorHAnsi" w:hAnsiTheme="majorHAnsi"/>
-          <w:color w:val="auto"/>
-          <w:sz w:val="20"/>
-          <w:szCs w:val="20"/>
-          <w:lang w:val="en-GB"/>
-        </w:rPr>
-        <w:t>fuel and oxidiser flow into a separate pintle style injector.</w:t>
+        <w:t>. Developed a complete thermodynamic simulation for the entire engine to predict performance.</w:t>
       </w:r>
     </w:p>
     <w:p>
@@ -2173,7 +1776,7 @@
           <w:ilvl w:val="0"/>
           <w:numId w:val="14"/>
         </w:numPr>
-        <w:spacing w:line="276" w:lineRule="auto"/>
+        <w:spacing w:before="0" w:line="276" w:lineRule="auto"/>
         <w:rPr>
           <w:rFonts w:asciiTheme="majorHAnsi" w:hAnsiTheme="majorHAnsi"/>
           <w:b/>
@@ -2187,87 +1790,12 @@
       <w:r>
         <w:rPr>
           <w:rFonts w:asciiTheme="majorHAnsi" w:hAnsiTheme="majorHAnsi"/>
-          <w:b/>
-          <w:bCs/>
-          <w:color w:val="004A67" w:themeColor="accent1" w:themeShade="80"/>
-          <w:sz w:val="20"/>
-          <w:szCs w:val="20"/>
-          <w:lang w:val="en-GB"/>
-        </w:rPr>
-        <w:t>Valve and injector</w:t>
-      </w:r>
-      <w:r>
-        <w:rPr>
-          <w:rFonts w:asciiTheme="majorHAnsi" w:hAnsiTheme="majorHAnsi"/>
-          <w:b/>
-          <w:bCs/>
-          <w:color w:val="004A67" w:themeColor="accent1" w:themeShade="80"/>
-          <w:sz w:val="20"/>
-          <w:szCs w:val="20"/>
-          <w:lang w:val="en-GB"/>
-        </w:rPr>
-        <w:t xml:space="preserve"> characterisation </w:t>
-      </w:r>
-      <w:r>
-        <w:rPr>
-          <w:rFonts w:asciiTheme="majorHAnsi" w:hAnsiTheme="majorHAnsi"/>
           <w:color w:val="auto"/>
           <w:sz w:val="20"/>
           <w:szCs w:val="20"/>
           <w:lang w:val="en-GB"/>
         </w:rPr>
-        <w:t xml:space="preserve">Characterised valve and injector empirical discharges and </w:t>
-      </w:r>
-      <w:r>
-        <w:rPr>
-          <w:rFonts w:asciiTheme="majorHAnsi" w:hAnsiTheme="majorHAnsi"/>
-          <w:color w:val="auto"/>
-          <w:sz w:val="20"/>
-          <w:szCs w:val="20"/>
-          <w:lang w:val="en-GB"/>
-        </w:rPr>
-        <w:t>iterated for optimal momentum ratios and spray angles. Developed a complete thermodynamic simulation for the entire engine to predict performance.</w:t>
-      </w:r>
-    </w:p>
-    <w:p>
-      <w:pPr>
-        <w:pStyle w:val="ListParagraph"/>
-        <w:numPr>
-          <w:ilvl w:val="0"/>
-          <w:numId w:val="14"/>
-        </w:numPr>
-        <w:spacing w:line="276" w:lineRule="auto"/>
-        <w:rPr>
-          <w:rFonts w:asciiTheme="majorHAnsi" w:hAnsiTheme="majorHAnsi"/>
-          <w:b/>
-          <w:bCs/>
-          <w:color w:val="auto"/>
-          <w:sz w:val="20"/>
-          <w:szCs w:val="20"/>
-          <w:lang w:val="en-GB"/>
-        </w:rPr>
-      </w:pPr>
-      <w:r>
-        <w:rPr>
-          <w:rFonts w:asciiTheme="majorHAnsi" w:hAnsiTheme="majorHAnsi"/>
-          <w:b/>
-          <w:bCs/>
-          <w:color w:val="004A67" w:themeColor="accent1" w:themeShade="80"/>
-          <w:sz w:val="20"/>
-          <w:szCs w:val="20"/>
-          <w:lang w:val="en-GB"/>
-        </w:rPr>
-        <w:t xml:space="preserve">Hot fire test campaign </w:t>
-      </w:r>
-      <w:r>
-        <w:rPr>
-          <w:rFonts w:asciiTheme="majorHAnsi" w:hAnsiTheme="majorHAnsi"/>
-          <w:color w:val="auto"/>
-          <w:sz w:val="20"/>
-          <w:szCs w:val="20"/>
-          <w:lang w:val="en-GB"/>
-        </w:rPr>
-        <w:t>First components manufactured after extensive prototyping, initial valve testing begun before hot fire campaign takes place.</w:t>
+        <w:t>Engine manufacturing and hydrostatic testing complete, with cold flow and hot fire next.</w:t>
       </w:r>
     </w:p>
     <w:p>
@@ -2286,6 +1814,8 @@
           <w:b/>
           <w:bCs/>
           <w:color w:val="004A67" w:themeColor="accent1" w:themeShade="80"/>
+          <w:sz w:val="20"/>
+          <w:szCs w:val="20"/>
           <w:lang w:val="en-GB"/>
         </w:rPr>
         <w:t xml:space="preserve">Summer Research Project, </w:t>
@@ -2296,22 +1826,48 @@
           <w:b/>
           <w:bCs/>
           <w:color w:val="004A67" w:themeColor="accent1" w:themeShade="80"/>
+          <w:sz w:val="20"/>
+          <w:szCs w:val="20"/>
           <w:lang w:val="en-GB"/>
         </w:rPr>
         <w:t>Shock Lab Research Group</w:t>
       </w:r>
-    </w:p>
-    <w:p>
-      <w:pPr>
+      <w:r>
         <w:rPr>
           <w:rFonts w:asciiTheme="majorHAnsi" w:hAnsiTheme="majorHAnsi"/>
-          <w:i/>
-          <w:iCs/>
+          <w:b/>
+          <w:bCs/>
+          <w:color w:val="004A67" w:themeColor="accent1" w:themeShade="80"/>
           <w:sz w:val="20"/>
           <w:szCs w:val="20"/>
           <w:lang w:val="en-GB"/>
         </w:rPr>
-      </w:pPr>
+        <w:t xml:space="preserve">                        </w:t>
+      </w:r>
+      <w:r>
+        <w:rPr>
+          <w:rFonts w:asciiTheme="majorHAnsi" w:hAnsiTheme="majorHAnsi"/>
+          <w:b/>
+          <w:bCs/>
+          <w:color w:val="004A67" w:themeColor="accent1" w:themeShade="80"/>
+          <w:sz w:val="20"/>
+          <w:szCs w:val="20"/>
+          <w:lang w:val="en-GB"/>
+        </w:rPr>
+        <w:t xml:space="preserve">              </w:t>
+      </w:r>
+      <w:r>
+        <w:rPr>
+          <w:rFonts w:asciiTheme="majorHAnsi" w:hAnsiTheme="majorHAnsi"/>
+          <w:b/>
+          <w:bCs/>
+          <w:color w:val="004A67" w:themeColor="accent1" w:themeShade="80"/>
+          <w:sz w:val="20"/>
+          <w:szCs w:val="20"/>
+          <w:lang w:val="en-GB"/>
+        </w:rPr>
+        <w:t xml:space="preserve">   </w:t>
+      </w:r>
       <w:r>
         <w:rPr>
           <w:rFonts w:asciiTheme="majorHAnsi" w:hAnsiTheme="majorHAnsi"/>
@@ -2342,11 +1898,9 @@
           <w:ilvl w:val="0"/>
           <w:numId w:val="14"/>
         </w:numPr>
-        <w:spacing w:line="276" w:lineRule="auto"/>
+        <w:spacing w:before="0" w:line="276" w:lineRule="auto"/>
         <w:rPr>
           <w:rFonts w:asciiTheme="majorHAnsi" w:hAnsiTheme="majorHAnsi"/>
-          <w:b/>
-          <w:bCs/>
           <w:color w:val="auto"/>
           <w:sz w:val="20"/>
           <w:szCs w:val="20"/>
@@ -2356,38 +1910,11 @@
       <w:r>
         <w:rPr>
           <w:rFonts w:asciiTheme="majorHAnsi" w:hAnsiTheme="majorHAnsi"/>
-          <w:b/>
-          <w:bCs/>
-          <w:color w:val="004A67" w:themeColor="accent1" w:themeShade="80"/>
+          <w:color w:val="auto"/>
           <w:sz w:val="20"/>
           <w:szCs w:val="20"/>
-          <w:lang w:val="en-GB"/>
         </w:rPr>
-        <w:t xml:space="preserve">Lab research and </w:t>
-      </w:r>
-      <w:r>
-        <w:rPr>
-          <w:rFonts w:asciiTheme="majorHAnsi" w:hAnsiTheme="majorHAnsi"/>
-          <w:b/>
-          <w:bCs/>
-          <w:color w:val="004A67" w:themeColor="accent1" w:themeShade="80"/>
-          <w:sz w:val="20"/>
-          <w:szCs w:val="20"/>
-          <w:lang w:val="en-GB"/>
-        </w:rPr>
-        <w:t>analysis</w:t>
-      </w:r>
-      <w:r>
-        <w:rPr>
-          <w:rFonts w:asciiTheme="majorHAnsi" w:hAnsiTheme="majorHAnsi"/>
-          <w:b/>
-          <w:bCs/>
-          <w:color w:val="004A67" w:themeColor="accent1" w:themeShade="80"/>
-          <w:sz w:val="20"/>
-          <w:szCs w:val="20"/>
-          <w:lang w:val="en-GB"/>
-        </w:rPr>
-        <w:t xml:space="preserve">. </w:t>
+        <w:t xml:space="preserve">Designed, manufactured, and tested a planar glass rocket nozzle to investigate Free Shock Separation (FSS) </w:t>
       </w:r>
       <w:r>
         <w:rPr>
@@ -2395,62 +1922,8 @@
           <w:color w:val="auto"/>
           <w:sz w:val="20"/>
           <w:szCs w:val="20"/>
-          <w:lang w:val="en-GB"/>
         </w:rPr>
-        <w:t>Gained experience with experimental techniques such as high speed schlieren</w:t>
-      </w:r>
-      <w:r>
-        <w:rPr>
-          <w:rFonts w:asciiTheme="majorHAnsi" w:hAnsiTheme="majorHAnsi"/>
-          <w:color w:val="auto"/>
-          <w:sz w:val="20"/>
-          <w:szCs w:val="20"/>
-          <w:lang w:val="en-GB"/>
-        </w:rPr>
-        <w:t xml:space="preserve"> and analysis of the complex data through numerical methods (e.g. Spectral Proper Orthogonal Decomposition). </w:t>
-      </w:r>
-    </w:p>
-    <w:p>
-      <w:pPr>
-        <w:pStyle w:val="ListParagraph"/>
-        <w:numPr>
-          <w:ilvl w:val="0"/>
-          <w:numId w:val="14"/>
-        </w:numPr>
-        <w:spacing w:line="276" w:lineRule="auto"/>
-        <w:rPr>
-          <w:rFonts w:asciiTheme="majorHAnsi" w:hAnsiTheme="majorHAnsi"/>
-          <w:b/>
-          <w:bCs/>
-          <w:color w:val="auto"/>
-          <w:sz w:val="20"/>
-          <w:szCs w:val="20"/>
-          <w:lang w:val="en-GB"/>
-        </w:rPr>
-      </w:pPr>
-      <w:r>
-        <w:rPr>
-          <w:rFonts w:asciiTheme="majorHAnsi" w:hAnsiTheme="majorHAnsi"/>
-          <w:b/>
-          <w:bCs/>
-          <w:color w:val="004A67" w:themeColor="accent1" w:themeShade="80"/>
-          <w:sz w:val="20"/>
-          <w:szCs w:val="20"/>
-          <w:lang w:val="en-GB"/>
-        </w:rPr>
-        <w:t>Overexpanded Glass Planar Rocket Nozzle</w:t>
-      </w:r>
-      <w:r>
-        <w:rPr>
-          <w:rFonts w:asciiTheme="majorHAnsi" w:hAnsiTheme="majorHAnsi"/>
-          <w:b/>
-          <w:bCs/>
-          <w:color w:val="004A67" w:themeColor="accent1" w:themeShade="80"/>
-          <w:sz w:val="20"/>
-          <w:szCs w:val="20"/>
-          <w:lang w:val="en-GB"/>
-        </w:rPr>
-        <w:t>.</w:t>
+        <w:t>phenomena.</w:t>
       </w:r>
       <w:r>
         <w:rPr>
@@ -2462,7 +1935,15 @@
         </w:rPr>
         <w:t xml:space="preserve"> </w:t>
       </w:r>
-      <w:r>
+    </w:p>
+    <w:p>
+      <w:pPr>
+        <w:pStyle w:val="ListParagraph"/>
+        <w:numPr>
+          <w:ilvl w:val="0"/>
+          <w:numId w:val="14"/>
+        </w:numPr>
+        <w:spacing w:before="0" w:line="276" w:lineRule="auto"/>
         <w:rPr>
           <w:rFonts w:asciiTheme="majorHAnsi" w:hAnsiTheme="majorHAnsi"/>
           <w:color w:val="auto"/>
@@ -2470,37 +1951,15 @@
           <w:szCs w:val="20"/>
           <w:lang w:val="en-GB"/>
         </w:rPr>
-        <w:t xml:space="preserve">Designed a </w:t>
-      </w:r>
+      </w:pPr>
       <w:r>
         <w:rPr>
           <w:rFonts w:asciiTheme="majorHAnsi" w:hAnsiTheme="majorHAnsi"/>
           <w:color w:val="auto"/>
           <w:sz w:val="20"/>
           <w:szCs w:val="20"/>
-          <w:lang w:val="en-GB"/>
         </w:rPr>
-        <w:t xml:space="preserve">planar glass rocket nozzle to investigate Free Shock Separation (FSS) in rocket engines. </w:t>
-      </w:r>
-      <w:r>
-        <w:rPr>
-          <w:rFonts w:asciiTheme="majorHAnsi" w:hAnsiTheme="majorHAnsi"/>
-          <w:color w:val="auto"/>
-          <w:sz w:val="20"/>
-          <w:szCs w:val="20"/>
-          <w:lang w:val="en-GB"/>
-        </w:rPr>
-        <w:t>Personally manufactured and tested the entire system.</w:t>
-      </w:r>
-      <w:r>
-        <w:rPr>
-          <w:rFonts w:asciiTheme="majorHAnsi" w:hAnsiTheme="majorHAnsi"/>
-          <w:color w:val="auto"/>
-          <w:sz w:val="20"/>
-          <w:szCs w:val="20"/>
-          <w:lang w:val="en-GB"/>
-        </w:rPr>
-        <w:t xml:space="preserve"> Gained key experience in CFD, design, manufacturing, high speed schlieren and analysis techniques.</w:t>
+        <w:t>Executed complex CFD analysis and processed high-speed schlieren imaging data utilising Spectral Proper Orthogonal Decomposition (SPOD).</w:t>
       </w:r>
     </w:p>
     <w:p>
@@ -2519,9 +1978,11 @@
           <w:b/>
           <w:bCs/>
           <w:color w:val="004A67" w:themeColor="accent1" w:themeShade="80"/>
+          <w:sz w:val="20"/>
+          <w:szCs w:val="20"/>
           <w:lang w:val="en-GB"/>
         </w:rPr>
-        <w:t>Assistant Robot Operator</w:t>
+        <w:t>Assistant Robot Operator, Titomic</w:t>
       </w:r>
       <w:r>
         <w:rPr>
@@ -2529,9 +1990,11 @@
           <w:b/>
           <w:bCs/>
           <w:color w:val="004A67" w:themeColor="accent1" w:themeShade="80"/>
+          <w:sz w:val="20"/>
+          <w:szCs w:val="20"/>
           <w:lang w:val="en-GB"/>
         </w:rPr>
-        <w:t xml:space="preserve">, </w:t>
+        <w:t xml:space="preserve">                                                                                                </w:t>
       </w:r>
       <w:r>
         <w:rPr>
@@ -2539,22 +2002,24 @@
           <w:b/>
           <w:bCs/>
           <w:color w:val="004A67" w:themeColor="accent1" w:themeShade="80"/>
-          <w:lang w:val="en-GB"/>
-        </w:rPr>
-        <w:t>Titomic</w:t>
-      </w:r>
-    </w:p>
-    <w:p>
-      <w:pPr>
-        <w:rPr>
-          <w:rFonts w:asciiTheme="majorHAnsi" w:hAnsiTheme="majorHAnsi"/>
-          <w:i/>
-          <w:iCs/>
           <w:sz w:val="20"/>
           <w:szCs w:val="20"/>
           <w:lang w:val="en-GB"/>
         </w:rPr>
-      </w:pPr>
+        <w:t xml:space="preserve">                 </w:t>
+      </w:r>
+      <w:r>
+        <w:rPr>
+          <w:rFonts w:asciiTheme="majorHAnsi" w:hAnsiTheme="majorHAnsi"/>
+          <w:b/>
+          <w:bCs/>
+          <w:color w:val="004A67" w:themeColor="accent1" w:themeShade="80"/>
+          <w:sz w:val="20"/>
+          <w:szCs w:val="20"/>
+          <w:lang w:val="en-GB"/>
+        </w:rPr>
+        <w:t xml:space="preserve">          </w:t>
+      </w:r>
       <w:r>
         <w:rPr>
           <w:rFonts w:asciiTheme="majorHAnsi" w:hAnsiTheme="majorHAnsi"/>
@@ -2574,11 +2039,10 @@
           <w:ilvl w:val="0"/>
           <w:numId w:val="14"/>
         </w:numPr>
-        <w:spacing w:line="276" w:lineRule="auto"/>
+        <w:spacing w:before="0" w:line="276" w:lineRule="auto"/>
         <w:rPr>
           <w:rFonts w:asciiTheme="majorHAnsi" w:hAnsiTheme="majorHAnsi"/>
-          <w:b/>
-          <w:bCs/>
+          <w:color w:val="auto"/>
           <w:sz w:val="18"/>
           <w:szCs w:val="18"/>
           <w:lang w:val="en-GB"/>
@@ -2587,86 +2051,11 @@
       <w:r>
         <w:rPr>
           <w:rFonts w:asciiTheme="majorHAnsi" w:hAnsiTheme="majorHAnsi"/>
-          <w:b/>
-          <w:bCs/>
-          <w:color w:val="004A67" w:themeColor="accent1" w:themeShade="80"/>
-          <w:sz w:val="20"/>
-          <w:szCs w:val="20"/>
-          <w:lang w:val="en-GB"/>
-        </w:rPr>
-        <w:t>Metallurgy</w:t>
-      </w:r>
-      <w:r>
-        <w:rPr>
-          <w:rFonts w:asciiTheme="majorHAnsi" w:hAnsiTheme="majorHAnsi"/>
-          <w:b/>
-          <w:bCs/>
-          <w:sz w:val="18"/>
-          <w:szCs w:val="18"/>
-          <w:lang w:val="en-GB"/>
-        </w:rPr>
-        <w:t>.</w:t>
-      </w:r>
-      <w:r>
-        <w:rPr>
-          <w:rFonts w:asciiTheme="majorHAnsi" w:hAnsiTheme="majorHAnsi"/>
-          <w:b/>
-          <w:bCs/>
-          <w:sz w:val="18"/>
-          <w:szCs w:val="18"/>
-          <w:lang w:val="en-GB"/>
-        </w:rPr>
-        <w:t xml:space="preserve"> </w:t>
-      </w:r>
-      <w:r>
-        <w:rPr>
-          <w:rFonts w:asciiTheme="majorHAnsi" w:hAnsiTheme="majorHAnsi"/>
           <w:color w:val="auto"/>
           <w:sz w:val="20"/>
           <w:szCs w:val="20"/>
-          <w:lang w:val="en-GB"/>
         </w:rPr>
-        <w:t xml:space="preserve">Supported research and development into material properties of new alloys created with cold spray additive manufacturing. Lab work involving cutting, polishing and analysing samples with a </w:t>
-      </w:r>
-      <w:r>
-        <w:rPr>
-          <w:rFonts w:asciiTheme="majorHAnsi" w:hAnsiTheme="majorHAnsi"/>
-          <w:color w:val="auto"/>
-          <w:sz w:val="20"/>
-          <w:szCs w:val="20"/>
-          <w:lang w:val="en-GB"/>
-        </w:rPr>
-        <w:t>high-powered</w:t>
-      </w:r>
-      <w:r>
-        <w:rPr>
-          <w:rFonts w:asciiTheme="majorHAnsi" w:hAnsiTheme="majorHAnsi"/>
-          <w:color w:val="auto"/>
-          <w:sz w:val="20"/>
-          <w:szCs w:val="20"/>
-          <w:lang w:val="en-GB"/>
-        </w:rPr>
-        <w:t xml:space="preserve"> microscope to investigate material properties. </w:t>
-      </w:r>
-      <w:r>
-        <w:rPr>
-          <w:rFonts w:asciiTheme="majorHAnsi" w:hAnsiTheme="majorHAnsi"/>
-          <w:color w:val="auto"/>
-          <w:sz w:val="20"/>
-          <w:szCs w:val="20"/>
-          <w:lang w:val="en-GB"/>
-        </w:rPr>
-        <w:t>Various materials testing</w:t>
-      </w:r>
-      <w:r>
-        <w:rPr>
-          <w:rFonts w:asciiTheme="majorHAnsi" w:hAnsiTheme="majorHAnsi"/>
-          <w:color w:val="auto"/>
-          <w:sz w:val="20"/>
-          <w:szCs w:val="20"/>
-          <w:lang w:val="en-GB"/>
-        </w:rPr>
-        <w:t>.</w:t>
+        <w:t>Operating 6-axis robots equipped with cold spray additive manufacturing heads to produce commercial components.</w:t>
       </w:r>
     </w:p>
     <w:p>
@@ -2676,11 +2065,10 @@
           <w:ilvl w:val="0"/>
           <w:numId w:val="14"/>
         </w:numPr>
-        <w:spacing w:line="276" w:lineRule="auto"/>
+        <w:spacing w:before="0" w:line="276" w:lineRule="auto"/>
         <w:rPr>
           <w:rFonts w:asciiTheme="majorHAnsi" w:hAnsiTheme="majorHAnsi"/>
-          <w:b/>
-          <w:bCs/>
+          <w:color w:val="auto"/>
           <w:sz w:val="18"/>
           <w:szCs w:val="18"/>
           <w:lang w:val="en-GB"/>
@@ -2689,73 +2077,11 @@
       <w:r>
         <w:rPr>
           <w:rFonts w:asciiTheme="majorHAnsi" w:hAnsiTheme="majorHAnsi"/>
-          <w:b/>
-          <w:bCs/>
-          <w:color w:val="004A67" w:themeColor="accent1" w:themeShade="80"/>
-          <w:sz w:val="20"/>
-          <w:szCs w:val="20"/>
-          <w:lang w:val="en-GB"/>
-        </w:rPr>
-        <w:t>Robot operator.</w:t>
-      </w:r>
-      <w:r>
-        <w:rPr>
-          <w:rFonts w:asciiTheme="majorHAnsi" w:hAnsiTheme="majorHAnsi"/>
-          <w:sz w:val="18"/>
-          <w:szCs w:val="18"/>
-          <w:lang w:val="en-GB"/>
-        </w:rPr>
-        <w:t xml:space="preserve"> </w:t>
-      </w:r>
-      <w:r>
-        <w:rPr>
-          <w:rFonts w:asciiTheme="majorHAnsi" w:hAnsiTheme="majorHAnsi"/>
           <w:color w:val="auto"/>
           <w:sz w:val="20"/>
           <w:szCs w:val="20"/>
-          <w:lang w:val="en-GB"/>
         </w:rPr>
-        <w:t xml:space="preserve">Experience operating 6-axis robots </w:t>
-      </w:r>
-      <w:r>
-        <w:rPr>
-          <w:rFonts w:asciiTheme="majorHAnsi" w:hAnsiTheme="majorHAnsi"/>
-          <w:color w:val="auto"/>
-          <w:sz w:val="20"/>
-          <w:szCs w:val="20"/>
-          <w:lang w:val="en-GB"/>
-        </w:rPr>
-        <w:t xml:space="preserve">with </w:t>
-      </w:r>
-      <w:r>
-        <w:rPr>
-          <w:rFonts w:asciiTheme="majorHAnsi" w:hAnsiTheme="majorHAnsi"/>
-          <w:color w:val="auto"/>
-          <w:sz w:val="20"/>
-          <w:szCs w:val="20"/>
-          <w:lang w:val="en-GB"/>
-        </w:rPr>
-        <w:t xml:space="preserve">cold spray heads, </w:t>
-      </w:r>
-      <w:r>
-        <w:rPr>
-          <w:rFonts w:asciiTheme="majorHAnsi" w:hAnsiTheme="majorHAnsi"/>
-          <w:color w:val="auto"/>
-          <w:sz w:val="20"/>
-          <w:szCs w:val="20"/>
-          <w:lang w:val="en-GB"/>
-        </w:rPr>
-        <w:t xml:space="preserve">producing products for industry. </w:t>
-      </w:r>
-      <w:r>
-        <w:rPr>
-          <w:rFonts w:asciiTheme="majorHAnsi" w:hAnsiTheme="majorHAnsi"/>
-          <w:color w:val="auto"/>
-          <w:sz w:val="20"/>
-          <w:szCs w:val="20"/>
-          <w:lang w:val="en-GB"/>
-        </w:rPr>
-        <w:t>Being involved with advanced contemporary manufacturing techniques adds to my design for manufacturing skillset, knowing the benefits and limitations of different technologies.</w:t>
+        <w:t>Conducting metallurgical R&amp;D on novel alloys, preparing and analysing samples via high-powered microscopy to evaluate material properties.</w:t>
       </w:r>
     </w:p>
     <w:p>
@@ -2765,11 +2091,10 @@
           <w:ilvl w:val="0"/>
           <w:numId w:val="14"/>
         </w:numPr>
-        <w:spacing w:line="276" w:lineRule="auto"/>
+        <w:spacing w:before="0" w:line="276" w:lineRule="auto"/>
         <w:rPr>
           <w:rFonts w:asciiTheme="majorHAnsi" w:hAnsiTheme="majorHAnsi"/>
-          <w:b/>
-          <w:bCs/>
+          <w:color w:val="auto"/>
           <w:sz w:val="18"/>
           <w:szCs w:val="18"/>
           <w:lang w:val="en-GB"/>
@@ -2778,97 +2103,21 @@
       <w:r>
         <w:rPr>
           <w:rFonts w:asciiTheme="majorHAnsi" w:hAnsiTheme="majorHAnsi"/>
-          <w:b/>
-          <w:bCs/>
-          <w:color w:val="004A67" w:themeColor="accent1" w:themeShade="80"/>
+          <w:color w:val="auto"/>
           <w:sz w:val="20"/>
           <w:szCs w:val="20"/>
-          <w:lang w:val="en-GB"/>
         </w:rPr>
-        <w:t>Machinist.</w:t>
-      </w:r>
-      <w:r>
-        <w:rPr>
-          <w:rFonts w:asciiTheme="majorHAnsi" w:hAnsiTheme="majorHAnsi"/>
-          <w:b/>
-          <w:bCs/>
-          <w:sz w:val="18"/>
-          <w:szCs w:val="18"/>
-          <w:lang w:val="en-GB"/>
-        </w:rPr>
-        <w:t xml:space="preserve"> </w:t>
-      </w:r>
-      <w:r>
-        <w:rPr>
-          <w:rFonts w:asciiTheme="majorHAnsi" w:hAnsiTheme="majorHAnsi"/>
-          <w:sz w:val="20"/>
-          <w:szCs w:val="20"/>
-          <w:lang w:val="en-GB"/>
-        </w:rPr>
-        <w:t xml:space="preserve">Extensive work machining various </w:t>
-      </w:r>
-      <w:r>
-        <w:rPr>
-          <w:rFonts w:asciiTheme="majorHAnsi" w:hAnsiTheme="majorHAnsi"/>
-          <w:sz w:val="20"/>
-          <w:szCs w:val="20"/>
-          <w:lang w:val="en-GB"/>
-        </w:rPr>
-        <w:t>scaffolds</w:t>
-      </w:r>
-      <w:r>
-        <w:rPr>
-          <w:rFonts w:asciiTheme="majorHAnsi" w:hAnsiTheme="majorHAnsi"/>
-          <w:sz w:val="20"/>
-          <w:szCs w:val="20"/>
-          <w:lang w:val="en-GB"/>
-        </w:rPr>
-        <w:t xml:space="preserve"> for </w:t>
-      </w:r>
-      <w:r>
-        <w:rPr>
-          <w:rFonts w:asciiTheme="majorHAnsi" w:hAnsiTheme="majorHAnsi"/>
-          <w:sz w:val="20"/>
-          <w:szCs w:val="20"/>
-          <w:lang w:val="en-GB"/>
-        </w:rPr>
-        <w:t xml:space="preserve">products, </w:t>
-      </w:r>
-      <w:r>
-        <w:rPr>
-          <w:rFonts w:asciiTheme="majorHAnsi" w:hAnsiTheme="majorHAnsi"/>
-          <w:sz w:val="20"/>
-          <w:szCs w:val="20"/>
-          <w:lang w:val="en-GB"/>
-        </w:rPr>
-        <w:t>tensile coupons for</w:t>
-      </w:r>
-      <w:r>
-        <w:rPr>
-          <w:rFonts w:asciiTheme="majorHAnsi" w:hAnsiTheme="majorHAnsi"/>
-          <w:sz w:val="20"/>
-          <w:szCs w:val="20"/>
-          <w:lang w:val="en-GB"/>
-        </w:rPr>
-        <w:t xml:space="preserve"> material research and </w:t>
-      </w:r>
-      <w:r>
-        <w:rPr>
-          <w:rFonts w:asciiTheme="majorHAnsi" w:hAnsiTheme="majorHAnsi"/>
-          <w:sz w:val="20"/>
-          <w:szCs w:val="20"/>
-          <w:lang w:val="en-GB"/>
-        </w:rPr>
-        <w:t>post-machining sprayed items. Developed my skills in design for manufacturing as well as manufacturing methods, which I have leveraged as a design engineer.</w:t>
+        <w:t>Machining product scaffolds, tensile coupons, and post-sprayed items using manual and CNC techniques.</w:t>
       </w:r>
     </w:p>
     <w:p>
       <w:pPr>
-        <w:pStyle w:val="ListParagraph"/>
+        <w:spacing w:before="0" w:line="276" w:lineRule="auto"/>
         <w:rPr>
           <w:rFonts w:asciiTheme="majorHAnsi" w:hAnsiTheme="majorHAnsi"/>
-          <w:sz w:val="20"/>
-          <w:szCs w:val="20"/>
+          <w:color w:val="auto"/>
+          <w:sz w:val="18"/>
+          <w:szCs w:val="18"/>
           <w:lang w:val="en-GB"/>
         </w:rPr>
       </w:pPr>
@@ -2876,6 +2125,7 @@
     <w:p>
       <w:pPr>
         <w:pStyle w:val="Heading1"/>
+        <w:spacing w:before="0"/>
         <w:rPr>
           <w:sz w:val="20"/>
           <w:szCs w:val="20"/>
@@ -2911,7 +2161,7 @@
         <mc:AlternateContent>
           <mc:Choice Requires="wps">
             <w:drawing>
-              <wp:inline distT="0" distB="0" distL="0" distR="0" wp14:anchorId="159FE035" wp14:editId="3169142B">
+              <wp:inline distT="0" distB="0" distL="0" distR="0" wp14:anchorId="7E3F4BDF" wp14:editId="5D4E9B4D">
                 <wp:extent cx="5943600" cy="0"/>
                 <wp:effectExtent l="0" t="0" r="0" b="0"/>
                 <wp:docPr id="104200130" name="Straight Connector 104200130">
@@ -2955,7 +2205,7 @@
           </mc:Choice>
           <mc:Fallback>
             <w:pict>
-              <v:line w14:anchorId="305D246C" id="Straight Connector 104200130" o:spid="_x0000_s1026" alt="&quot;&quot;" style="visibility:visible;mso-wrap-style:square;mso-left-percent:-10001;mso-top-percent:-10001;mso-position-horizontal:absolute;mso-position-horizontal-relative:char;mso-position-vertical:absolute;mso-position-vertical-relative:line;mso-left-percent:-10001;mso-top-percent:-10001" from="0,0" to="468pt,0" o:gfxdata="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" strokecolor="#bfbfbf" strokeweight=".5pt">
+              <v:line w14:anchorId="1F56756F" id="Straight Connector 104200130" o:spid="_x0000_s1026" alt="&quot;&quot;" style="visibility:visible;mso-wrap-style:square;mso-left-percent:-10001;mso-top-percent:-10001;mso-position-horizontal:absolute;mso-position-horizontal-relative:char;mso-position-vertical:absolute;mso-position-vertical-relative:line;mso-left-percent:-10001;mso-top-percent:-10001" from="0,0" to="468pt,0" o:gfxdata="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" strokecolor="#bfbfbf" strokeweight=".5pt">
                 <v:stroke joinstyle="miter"/>
                 <w10:anchorlock/>
               </v:line>
@@ -2966,6 +2216,7 @@
     </w:p>
     <w:p>
       <w:pPr>
+        <w:spacing w:before="0"/>
         <w:rPr>
           <w:rFonts w:asciiTheme="majorHAnsi" w:hAnsiTheme="majorHAnsi"/>
           <w:sz w:val="20"/>
@@ -2983,20 +2234,35 @@
           <w:szCs w:val="20"/>
           <w:lang w:val="en-GB"/>
         </w:rPr>
-        <w:t xml:space="preserve">Jim Furfaro Award for Technical Excellence, IREC 2025 </w:t>
+        <w:t>Jim Furfaro Award for Technical Excellence, IREC 2025</w:t>
       </w:r>
       <w:r>
         <w:rPr>
           <w:rFonts w:asciiTheme="majorHAnsi" w:hAnsiTheme="majorHAnsi"/>
+          <w:b/>
+          <w:bCs/>
+          <w:color w:val="004A67" w:themeColor="accent1" w:themeShade="80"/>
           <w:sz w:val="20"/>
           <w:szCs w:val="20"/>
           <w:lang w:val="en-GB"/>
         </w:rPr>
-        <w:t>– June 2025</w:t>
+        <w:t xml:space="preserve">                                                                                        </w:t>
+      </w:r>
+      <w:r>
+        <w:rPr>
+          <w:rFonts w:asciiTheme="majorHAnsi" w:hAnsiTheme="majorHAnsi"/>
+          <w:i/>
+          <w:iCs/>
+          <w:sz w:val="20"/>
+          <w:szCs w:val="20"/>
+          <w:lang w:val="en-GB"/>
+        </w:rPr>
+        <w:t xml:space="preserve">  2025</w:t>
       </w:r>
     </w:p>
     <w:p>
       <w:pPr>
+        <w:spacing w:before="0"/>
         <w:rPr>
           <w:rFonts w:asciiTheme="majorHAnsi" w:hAnsiTheme="majorHAnsi"/>
           <w:sz w:val="20"/>
@@ -3023,11 +2289,43 @@
           <w:szCs w:val="20"/>
           <w:lang w:val="en-GB"/>
         </w:rPr>
-        <w:t>– June 2025</w:t>
+        <w:t xml:space="preserve">– </w:t>
+      </w:r>
+      <w:r>
+        <w:rPr>
+          <w:rFonts w:asciiTheme="majorHAnsi" w:hAnsiTheme="majorHAnsi"/>
+          <w:sz w:val="20"/>
+          <w:szCs w:val="20"/>
+          <w:lang w:val="en-GB"/>
+        </w:rPr>
+        <w:t xml:space="preserve">                                                                                    </w:t>
+      </w:r>
+      <w:r>
+        <w:rPr>
+          <w:rFonts w:asciiTheme="majorHAnsi" w:hAnsiTheme="majorHAnsi"/>
+          <w:i/>
+          <w:iCs/>
+          <w:sz w:val="20"/>
+          <w:szCs w:val="20"/>
+          <w:lang w:val="en-GB"/>
+        </w:rPr>
+        <w:t xml:space="preserve">         </w:t>
+      </w:r>
+      <w:r>
+        <w:rPr>
+          <w:rFonts w:asciiTheme="majorHAnsi" w:hAnsiTheme="majorHAnsi"/>
+          <w:i/>
+          <w:iCs/>
+          <w:sz w:val="20"/>
+          <w:szCs w:val="20"/>
+          <w:lang w:val="en-GB"/>
+        </w:rPr>
+        <w:t xml:space="preserve"> 2025</w:t>
       </w:r>
     </w:p>
     <w:p>
       <w:pPr>
+        <w:spacing w:before="0"/>
         <w:rPr>
           <w:rFonts w:asciiTheme="majorHAnsi" w:hAnsiTheme="majorHAnsi"/>
           <w:b/>
@@ -3060,20 +2358,35 @@
           <w:szCs w:val="20"/>
           <w:lang w:val="en-GB"/>
         </w:rPr>
-        <w:t xml:space="preserve"> – </w:t>
+        <w:t xml:space="preserve"> </w:t>
       </w:r>
       <w:r>
         <w:rPr>
           <w:rFonts w:asciiTheme="majorHAnsi" w:hAnsiTheme="majorHAnsi"/>
+          <w:b/>
+          <w:bCs/>
+          <w:color w:val="004A67" w:themeColor="accent1" w:themeShade="80"/>
           <w:sz w:val="20"/>
           <w:szCs w:val="20"/>
           <w:lang w:val="en-GB"/>
         </w:rPr>
-        <w:t>March 2023 – May 2023</w:t>
+        <w:t xml:space="preserve">                                                                                                                  </w:t>
+      </w:r>
+      <w:r>
+        <w:rPr>
+          <w:rFonts w:asciiTheme="majorHAnsi" w:hAnsiTheme="majorHAnsi"/>
+          <w:i/>
+          <w:iCs/>
+          <w:sz w:val="20"/>
+          <w:szCs w:val="20"/>
+          <w:lang w:val="en-GB"/>
+        </w:rPr>
+        <w:t>2023</w:t>
       </w:r>
     </w:p>
     <w:p>
       <w:pPr>
+        <w:spacing w:before="0"/>
         <w:rPr>
           <w:rFonts w:asciiTheme="majorHAnsi" w:hAnsiTheme="majorHAnsi"/>
           <w:b/>
@@ -3106,146 +2419,8 @@
           <w:szCs w:val="20"/>
           <w:lang w:val="en-GB"/>
         </w:rPr>
-        <w:t xml:space="preserve"> – </w:t>
+        <w:t xml:space="preserve"> </w:t>
       </w:r>
-      <w:r>
-        <w:rPr>
-          <w:rFonts w:asciiTheme="majorHAnsi" w:hAnsiTheme="majorHAnsi"/>
-          <w:sz w:val="20"/>
-          <w:szCs w:val="20"/>
-          <w:lang w:val="en-GB"/>
-        </w:rPr>
-        <w:t>April 2023 – April 2023</w:t>
-      </w:r>
-    </w:p>
-    <w:p>
-      <w:pPr>
-        <w:rPr>
-          <w:rFonts w:asciiTheme="majorHAnsi" w:hAnsiTheme="majorHAnsi"/>
-          <w:sz w:val="20"/>
-          <w:szCs w:val="20"/>
-          <w:lang w:val="en-GB"/>
-        </w:rPr>
-      </w:pPr>
-    </w:p>
-    <w:p>
-      <w:pPr>
-        <w:pStyle w:val="Heading1"/>
-        <w:rPr>
-          <w:sz w:val="20"/>
-          <w:szCs w:val="20"/>
-          <w:lang w:val="en-GB"/>
-        </w:rPr>
-      </w:pPr>
-      <w:sdt>
-        <w:sdtPr>
-          <w:rPr>
-            <w:sz w:val="20"/>
-            <w:szCs w:val="20"/>
-            <w:lang w:val="en-GB"/>
-          </w:rPr>
-          <w:id w:val="1904716257"/>
-          <w:placeholder>
-            <w:docPart w:val="8D9350A820BA4EA991CA66BB9A71E652"/>
-          </w:placeholder>
-          <w:temporary/>
-          <w:showingPlcHdr/>
-          <w15:appearance w15:val="hidden"/>
-        </w:sdtPr>
-        <w:sdtContent>
-          <w:r>
-            <w:rPr>
-              <w:sz w:val="20"/>
-              <w:szCs w:val="20"/>
-              <w:lang w:val="en-GB"/>
-            </w:rPr>
-            <w:t>Skills &amp; Abilities</w:t>
-          </w:r>
-        </w:sdtContent>
-      </w:sdt>
-    </w:p>
-    <w:p>
-      <w:pPr>
-        <w:pStyle w:val="Line"/>
-        <w:rPr>
-          <w:rFonts w:asciiTheme="majorHAnsi" w:hAnsiTheme="majorHAnsi"/>
-          <w:sz w:val="20"/>
-          <w:szCs w:val="20"/>
-          <w:lang w:val="en-GB"/>
-        </w:rPr>
-      </w:pPr>
-      <w:r>
-        <w:rPr>
-          <w:rFonts w:asciiTheme="majorHAnsi" w:hAnsiTheme="majorHAnsi"/>
-          <w:sz w:val="20"/>
-          <w:szCs w:val="20"/>
-          <w:lang w:val="en-GB"/>
-        </w:rPr>
-        <mc:AlternateContent>
-          <mc:Choice Requires="wps">
-            <w:drawing>
-              <wp:inline distT="0" distB="0" distL="0" distR="0" wp14:anchorId="7D1F3A90" wp14:editId="3216B20E">
-                <wp:extent cx="5943600" cy="0"/>
-                <wp:effectExtent l="0" t="0" r="0" b="0"/>
-                <wp:docPr id="16880014" name="Straight Connector 16880014">
-                  <a:extLst xmlns:a="http://schemas.openxmlformats.org/drawingml/2006/main">
-                    <a:ext uri="{C183D7F6-B498-43B3-948B-1728B52AA6E4}">
-                      <adec:decorative xmlns:adec="http://schemas.microsoft.com/office/drawing/2017/decorative" val="1"/>
-                    </a:ext>
-                  </a:extLst>
-                </wp:docPr>
-                <wp:cNvGraphicFramePr/>
-                <a:graphic xmlns:a="http://schemas.openxmlformats.org/drawingml/2006/main">
-                  <a:graphicData uri="http://schemas.microsoft.com/office/word/2010/wordprocessingShape">
-                    <wps:wsp>
-                      <wps:cNvCnPr/>
-                      <wps:spPr>
-                        <a:xfrm>
-                          <a:off x="0" y="0"/>
-                          <a:ext cx="5943600" cy="0"/>
-                        </a:xfrm>
-                        <a:prstGeom prst="line">
-                          <a:avLst/>
-                        </a:prstGeom>
-                        <a:noFill/>
-                        <a:ln w="6350" cap="flat" cmpd="sng" algn="ctr">
-                          <a:solidFill>
-                            <a:sysClr val="window" lastClr="FFFFFF">
-                              <a:lumMod val="75000"/>
-                            </a:sysClr>
-                          </a:solidFill>
-                          <a:prstDash val="solid"/>
-                          <a:miter lim="800000"/>
-                        </a:ln>
-                        <a:effectLst/>
-                      </wps:spPr>
-                      <wps:bodyPr/>
-                    </wps:wsp>
-                  </a:graphicData>
-                </a:graphic>
-              </wp:inline>
-            </w:drawing>
-          </mc:Choice>
-          <mc:Fallback>
-            <w:pict>
-              <v:line w14:anchorId="1592343F" id="Straight Connector 16880014" o:spid="_x0000_s1026" alt="&quot;&quot;" style="visibility:visible;mso-wrap-style:square;mso-left-percent:-10001;mso-top-percent:-10001;mso-position-horizontal:absolute;mso-position-horizontal-relative:char;mso-position-vertical:absolute;mso-position-vertical-relative:line;mso-left-percent:-10001;mso-top-percent:-10001" from="0,0" to="468pt,0" o:gfxdata="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" strokecolor="#bfbfbf" strokeweight=".5pt">
-                <v:stroke joinstyle="miter"/>
-                <w10:anchorlock/>
-              </v:line>
-            </w:pict>
-          </mc:Fallback>
-        </mc:AlternateContent>
-      </w:r>
-    </w:p>
-    <w:p>
-      <w:pPr>
-        <w:rPr>
-          <w:rFonts w:asciiTheme="majorHAnsi" w:hAnsiTheme="majorHAnsi"/>
-          <w:sz w:val="20"/>
-          <w:szCs w:val="20"/>
-          <w:lang w:val="en-GB"/>
-        </w:rPr>
-      </w:pPr>
       <w:r>
         <w:rPr>
           <w:rFonts w:asciiTheme="majorHAnsi" w:hAnsiTheme="majorHAnsi"/>
@@ -3256,7 +2431,7 @@
           <w:szCs w:val="20"/>
           <w:lang w:val="en-GB"/>
         </w:rPr>
-        <w:t>Software:</w:t>
+        <w:t xml:space="preserve">                                                                                      </w:t>
       </w:r>
       <w:r>
         <w:rPr>
@@ -3265,271 +2440,7 @@
           <w:szCs w:val="20"/>
           <w:lang w:val="en-GB"/>
         </w:rPr>
-        <w:t xml:space="preserve"> </w:t>
-      </w:r>
-      <w:r>
-        <w:rPr>
-          <w:rFonts w:asciiTheme="majorHAnsi" w:hAnsiTheme="majorHAnsi"/>
-          <w:sz w:val="20"/>
-          <w:szCs w:val="20"/>
-          <w:lang w:val="en-GB"/>
-        </w:rPr>
-        <w:t>Siemens NX and Teamcenter,</w:t>
-      </w:r>
-      <w:r>
-        <w:rPr>
-          <w:rFonts w:asciiTheme="majorHAnsi" w:hAnsiTheme="majorHAnsi"/>
-          <w:sz w:val="20"/>
-          <w:szCs w:val="20"/>
-          <w:lang w:val="en-GB"/>
-        </w:rPr>
-        <w:t xml:space="preserve"> PTC Creo and Windchill PLM, </w:t>
-      </w:r>
-      <w:r>
-        <w:rPr>
-          <w:rFonts w:asciiTheme="majorHAnsi" w:hAnsiTheme="majorHAnsi"/>
-          <w:sz w:val="20"/>
-          <w:szCs w:val="20"/>
-          <w:lang w:val="en-GB"/>
-        </w:rPr>
-        <w:t>SOLIDWORKS Computer-Aided Design</w:t>
-      </w:r>
-      <w:r>
-        <w:rPr>
-          <w:rFonts w:asciiTheme="majorHAnsi" w:hAnsiTheme="majorHAnsi"/>
-          <w:sz w:val="20"/>
-          <w:szCs w:val="20"/>
-          <w:lang w:val="en-GB"/>
-        </w:rPr>
-        <w:t xml:space="preserve">, </w:t>
-      </w:r>
-      <w:r>
-        <w:rPr>
-          <w:rFonts w:asciiTheme="majorHAnsi" w:hAnsiTheme="majorHAnsi"/>
-          <w:sz w:val="20"/>
-          <w:szCs w:val="20"/>
-          <w:lang w:val="en-GB"/>
-        </w:rPr>
-        <w:t>Fusion 360 CAM</w:t>
-      </w:r>
-      <w:r>
-        <w:rPr>
-          <w:rFonts w:asciiTheme="majorHAnsi" w:hAnsiTheme="majorHAnsi"/>
-          <w:sz w:val="20"/>
-          <w:szCs w:val="20"/>
-          <w:lang w:val="en-GB"/>
-        </w:rPr>
-        <w:t>, KiCad</w:t>
-      </w:r>
-    </w:p>
-    <w:p>
-      <w:pPr>
-        <w:rPr>
-          <w:rFonts w:asciiTheme="majorHAnsi" w:hAnsiTheme="majorHAnsi"/>
-          <w:sz w:val="20"/>
-          <w:szCs w:val="20"/>
-          <w:lang w:val="en-GB"/>
-        </w:rPr>
-      </w:pPr>
-      <w:r>
-        <w:rPr>
-          <w:rFonts w:asciiTheme="majorHAnsi" w:hAnsiTheme="majorHAnsi"/>
-          <w:b/>
-          <w:bCs/>
-          <w:color w:val="004A67" w:themeColor="accent1" w:themeShade="80"/>
-          <w:sz w:val="20"/>
-          <w:szCs w:val="20"/>
-          <w:lang w:val="en-GB"/>
-        </w:rPr>
-        <w:t xml:space="preserve">Manufacturing: </w:t>
-      </w:r>
-      <w:r>
-        <w:rPr>
-          <w:rFonts w:asciiTheme="majorHAnsi" w:hAnsiTheme="majorHAnsi"/>
-          <w:sz w:val="20"/>
-          <w:szCs w:val="20"/>
-          <w:lang w:val="en-GB"/>
-        </w:rPr>
-        <w:t>Welding</w:t>
-      </w:r>
-      <w:r>
-        <w:rPr>
-          <w:rFonts w:asciiTheme="majorHAnsi" w:hAnsiTheme="majorHAnsi"/>
-          <w:sz w:val="20"/>
-          <w:szCs w:val="20"/>
-          <w:lang w:val="en-GB"/>
-        </w:rPr>
-        <w:t>,</w:t>
-      </w:r>
-      <w:r>
-        <w:rPr>
-          <w:rFonts w:asciiTheme="majorHAnsi" w:hAnsiTheme="majorHAnsi"/>
-          <w:sz w:val="20"/>
-          <w:szCs w:val="20"/>
-          <w:lang w:val="en-GB"/>
-        </w:rPr>
-        <w:t xml:space="preserve"> </w:t>
-      </w:r>
-      <w:r>
-        <w:rPr>
-          <w:rFonts w:asciiTheme="majorHAnsi" w:hAnsiTheme="majorHAnsi"/>
-          <w:sz w:val="20"/>
-          <w:szCs w:val="20"/>
-          <w:lang w:val="en-GB"/>
-        </w:rPr>
-        <w:t>F</w:t>
-      </w:r>
-      <w:r>
-        <w:rPr>
-          <w:rFonts w:asciiTheme="majorHAnsi" w:hAnsiTheme="majorHAnsi"/>
-          <w:sz w:val="20"/>
-          <w:szCs w:val="20"/>
-          <w:lang w:val="en-GB"/>
-        </w:rPr>
-        <w:t xml:space="preserve">abrication, Manual and CNC </w:t>
-      </w:r>
-      <w:r>
-        <w:rPr>
-          <w:rFonts w:asciiTheme="majorHAnsi" w:hAnsiTheme="majorHAnsi"/>
-          <w:sz w:val="20"/>
-          <w:szCs w:val="20"/>
-          <w:lang w:val="en-GB"/>
-        </w:rPr>
-        <w:t>M</w:t>
-      </w:r>
-      <w:r>
-        <w:rPr>
-          <w:rFonts w:asciiTheme="majorHAnsi" w:hAnsiTheme="majorHAnsi"/>
-          <w:sz w:val="20"/>
-          <w:szCs w:val="20"/>
-          <w:lang w:val="en-GB"/>
-        </w:rPr>
-        <w:t>achining (lathe and milling machine)</w:t>
-      </w:r>
-      <w:r>
-        <w:rPr>
-          <w:rFonts w:asciiTheme="majorHAnsi" w:hAnsiTheme="majorHAnsi"/>
-          <w:sz w:val="20"/>
-          <w:szCs w:val="20"/>
-          <w:lang w:val="en-GB"/>
-        </w:rPr>
-        <w:t>, Additive manufacturing, Drawing (ASME Y14.5)</w:t>
-      </w:r>
-    </w:p>
-    <w:p>
-      <w:pPr>
-        <w:rPr>
-          <w:rFonts w:asciiTheme="majorHAnsi" w:hAnsiTheme="majorHAnsi"/>
-          <w:sz w:val="20"/>
-          <w:szCs w:val="20"/>
-          <w:lang w:val="en-GB"/>
-        </w:rPr>
-      </w:pPr>
-      <w:r>
-        <w:rPr>
-          <w:rFonts w:asciiTheme="majorHAnsi" w:hAnsiTheme="majorHAnsi"/>
-          <w:b/>
-          <w:bCs/>
-          <w:color w:val="004A67" w:themeColor="accent1" w:themeShade="80"/>
-          <w:sz w:val="20"/>
-          <w:szCs w:val="20"/>
-          <w:lang w:val="en-GB"/>
-        </w:rPr>
-        <w:t xml:space="preserve">Programming Languages: </w:t>
-      </w:r>
-      <w:r>
-        <w:rPr>
-          <w:rFonts w:asciiTheme="majorHAnsi" w:hAnsiTheme="majorHAnsi"/>
-          <w:sz w:val="20"/>
-          <w:szCs w:val="20"/>
-          <w:lang w:val="en-GB"/>
-        </w:rPr>
-        <w:t>MATLAB</w:t>
-      </w:r>
-      <w:r>
-        <w:rPr>
-          <w:rFonts w:asciiTheme="majorHAnsi" w:hAnsiTheme="majorHAnsi"/>
-          <w:sz w:val="20"/>
-          <w:szCs w:val="20"/>
-          <w:lang w:val="en-GB"/>
-        </w:rPr>
-        <w:t xml:space="preserve"> &amp; Simulink</w:t>
-      </w:r>
-      <w:r>
-        <w:rPr>
-          <w:rFonts w:asciiTheme="majorHAnsi" w:hAnsiTheme="majorHAnsi"/>
-          <w:sz w:val="20"/>
-          <w:szCs w:val="20"/>
-          <w:lang w:val="en-GB"/>
-        </w:rPr>
-        <w:t>, Python,</w:t>
-      </w:r>
-      <w:r>
-        <w:rPr>
-          <w:rFonts w:asciiTheme="majorHAnsi" w:hAnsiTheme="majorHAnsi"/>
-          <w:sz w:val="20"/>
-          <w:szCs w:val="20"/>
-          <w:lang w:val="en-GB"/>
-        </w:rPr>
-        <w:t xml:space="preserve"> C++,</w:t>
-      </w:r>
-      <w:r>
-        <w:rPr>
-          <w:rFonts w:asciiTheme="majorHAnsi" w:hAnsiTheme="majorHAnsi"/>
-          <w:sz w:val="20"/>
-          <w:szCs w:val="20"/>
-          <w:lang w:val="en-GB"/>
-        </w:rPr>
-        <w:t xml:space="preserve"> C#, JavaScript</w:t>
-      </w:r>
-    </w:p>
-    <w:p>
-      <w:pPr>
-        <w:rPr>
-          <w:rFonts w:asciiTheme="majorHAnsi" w:hAnsiTheme="majorHAnsi"/>
-          <w:sz w:val="20"/>
-          <w:szCs w:val="20"/>
-          <w:lang w:val="en-GB"/>
-        </w:rPr>
-      </w:pPr>
-      <w:r>
-        <w:rPr>
-          <w:rFonts w:asciiTheme="majorHAnsi" w:hAnsiTheme="majorHAnsi"/>
-          <w:b/>
-          <w:bCs/>
-          <w:color w:val="004A67" w:themeColor="accent1" w:themeShade="80"/>
-          <w:sz w:val="20"/>
-          <w:szCs w:val="20"/>
-          <w:lang w:val="en-GB"/>
-        </w:rPr>
-        <w:t xml:space="preserve">Simulation: </w:t>
-      </w:r>
-      <w:r>
-        <w:rPr>
-          <w:rFonts w:asciiTheme="majorHAnsi" w:hAnsiTheme="majorHAnsi"/>
-          <w:sz w:val="20"/>
-          <w:szCs w:val="20"/>
-          <w:lang w:val="en-GB"/>
-        </w:rPr>
-        <w:t>Ansys Finite Element Analysis and Computational Fluid Dynamics</w:t>
-      </w:r>
-      <w:r>
-        <w:rPr>
-          <w:rFonts w:asciiTheme="majorHAnsi" w:hAnsiTheme="majorHAnsi"/>
-          <w:sz w:val="20"/>
-          <w:szCs w:val="20"/>
-          <w:lang w:val="en-GB"/>
-        </w:rPr>
-        <w:t xml:space="preserve">, NX Simcenter </w:t>
-      </w:r>
-      <w:r>
-        <w:rPr>
-          <w:rFonts w:asciiTheme="majorHAnsi" w:hAnsiTheme="majorHAnsi"/>
-          <w:sz w:val="20"/>
-          <w:szCs w:val="20"/>
-          <w:lang w:val="en-GB"/>
-        </w:rPr>
-        <w:t>(NASTRAN)</w:t>
+        <w:t>2023</w:t>
       </w:r>
     </w:p>
     <w:sectPr>
@@ -5278,7 +4189,6 @@
   <w:style w:type="character" w:default="1" w:styleId="DefaultParagraphFont">
     <w:name w:val="Default Paragraph Font"/>
     <w:uiPriority w:val="1"/>
-    <w:semiHidden/>
     <w:unhideWhenUsed/>
   </w:style>
   <w:style w:type="table" w:default="1" w:styleId="TableNormal">
@@ -30010,7 +28920,7 @@
   <w:docParts>
     <w:docPart>
       <w:docPartPr>
-        <w:name w:val="8D9350A820BA4EA991CA66BB9A71E652"/>
+        <w:name w:val="9A1A3614FFCE4769AA697192D0793E01"/>
         <w:category>
           <w:name w:val="General"/>
           <w:gallery w:val="placeholder"/>
@@ -30021,12 +28931,12 @@
         <w:behaviors>
           <w:behavior w:val="content"/>
         </w:behaviors>
-        <w:guid w:val="{DB665592-36FE-4E3E-8710-AE09572B643A}"/>
+        <w:guid w:val="{3843A930-F402-42C0-A4C8-3C3D4924D610}"/>
       </w:docPartPr>
       <w:docPartBody>
         <w:p>
           <w:pPr>
-            <w:pStyle w:val="8D9350A820BA4EA991CA66BB9A71E652"/>
+            <w:pStyle w:val="9A1A3614FFCE4769AA697192D0793E01"/>
           </w:pPr>
           <w:r>
             <w:t>Skills &amp; Abilities</w:t>
@@ -30127,6 +29037,13 @@
     <w:pitch w:val="fixed"/>
     <w:sig w:usb0="E00006FF" w:usb1="0000FCFF" w:usb2="00000001" w:usb3="00000000" w:csb0="0000019F" w:csb1="00000000"/>
   </w:font>
+  <w:font w:name="Arial">
+    <w:panose1 w:val="020B0604020202020204"/>
+    <w:charset w:val="00"/>
+    <w:family w:val="swiss"/>
+    <w:pitch w:val="variable"/>
+    <w:sig w:usb0="E0002EFF" w:usb1="C000785B" w:usb2="00000009" w:usb3="00000000" w:csb0="000001FF" w:csb1="00000000"/>
+  </w:font>
   <w:font w:name="Aptos">
     <w:charset w:val="00"/>
     <w:family w:val="swiss"/>
@@ -30138,13 +29055,6 @@
     <w:family w:val="roman"/>
     <w:pitch w:val="variable"/>
     <w:sig w:usb0="800002E7" w:usb1="2AC7FCFF" w:usb2="00000012" w:usb3="00000000" w:csb0="0002009F" w:csb1="00000000"/>
-  </w:font>
-  <w:font w:name="Arial">
-    <w:panose1 w:val="020B0604020202020204"/>
-    <w:charset w:val="00"/>
-    <w:family w:val="swiss"/>
-    <w:pitch w:val="variable"/>
-    <w:sig w:usb0="E0002EFF" w:usb1="C000785B" w:usb2="00000009" w:usb3="00000000" w:csb0="000001FF" w:csb1="00000000"/>
   </w:font>
   <w:font w:name="Aptos Display">
     <w:charset w:val="00"/>
@@ -30179,6 +29089,7 @@
   <w:rsids>
     <w:rsidRoot w:val="001D5399"/>
     <w:rsid w:val="00032A52"/>
+    <w:rsid w:val="000C798D"/>
     <w:rsid w:val="0016706D"/>
     <w:rsid w:val="001B3AB2"/>
     <w:rsid w:val="001C0E9A"/>
@@ -30191,8 +29102,10 @@
     <w:rsid w:val="003C2DAD"/>
     <w:rsid w:val="003D54D9"/>
     <w:rsid w:val="0048274A"/>
+    <w:rsid w:val="004A12E0"/>
     <w:rsid w:val="004A4C49"/>
     <w:rsid w:val="004C04F3"/>
+    <w:rsid w:val="00546AFC"/>
     <w:rsid w:val="00555DC9"/>
     <w:rsid w:val="00592E7B"/>
     <w:rsid w:val="005C2A14"/>
@@ -30216,12 +29129,15 @@
     <w:rsid w:val="00BC1E93"/>
     <w:rsid w:val="00BC22DC"/>
     <w:rsid w:val="00C550D7"/>
+    <w:rsid w:val="00C70D8C"/>
     <w:rsid w:val="00C9000E"/>
     <w:rsid w:val="00CA532F"/>
     <w:rsid w:val="00D31FBD"/>
     <w:rsid w:val="00D77F77"/>
+    <w:rsid w:val="00D87B89"/>
     <w:rsid w:val="00DE5306"/>
     <w:rsid w:val="00EA11EA"/>
+    <w:rsid w:val="00EC42FB"/>
     <w:rsid w:val="00EE5CBB"/>
     <w:rsid w:val="00F94185"/>
   </w:rsids>
@@ -30705,14 +29621,6 @@
       <w:color w:val="595959" w:themeColor="text1" w:themeTint="A6"/>
     </w:rPr>
   </w:style>
-  <w:style w:type="paragraph" w:customStyle="1" w:styleId="16EF1D77E15A458887E417EB363F0D83">
-    <w:name w:val="16EF1D77E15A458887E417EB363F0D83"/>
-    <w:rsid w:val="00592E7B"/>
-    <w:rPr>
-      <w:kern w:val="2"/>
-      <w14:ligatures w14:val="standardContextual"/>
-    </w:rPr>
-  </w:style>
   <w:style w:type="character" w:customStyle="1" w:styleId="Heading1Char">
     <w:name w:val="Heading 1 Char"/>
     <w:basedOn w:val="DefaultParagraphFont"/>
@@ -30731,6 +29639,20 @@
   <w:style w:type="paragraph" w:customStyle="1" w:styleId="8D9350A820BA4EA991CA66BB9A71E652">
     <w:name w:val="8D9350A820BA4EA991CA66BB9A71E652"/>
     <w:rsid w:val="0064568B"/>
+    <w:pPr>
+      <w:spacing w:line="278" w:lineRule="auto"/>
+    </w:pPr>
+    <w:rPr>
+      <w:kern w:val="2"/>
+      <w:sz w:val="24"/>
+      <w:szCs w:val="24"/>
+      <w:lang w:val="en-AU" w:eastAsia="zh-CN"/>
+      <w14:ligatures w14:val="standardContextual"/>
+    </w:rPr>
+  </w:style>
+  <w:style w:type="paragraph" w:customStyle="1" w:styleId="9A1A3614FFCE4769AA697192D0793E01">
+    <w:name w:val="9A1A3614FFCE4769AA697192D0793E01"/>
+    <w:rsid w:val="000C798D"/>
     <w:pPr>
       <w:spacing w:line="278" w:lineRule="auto"/>
     </w:pPr>

</xml_diff>